<commit_message>
Working on Dio package
</commit_message>
<xml_diff>
--- a/flutter_documents/f21_dio_and_retrofit_advanced_api_calling_in_flutter.docx
+++ b/flutter_documents/f21_dio_and_retrofit_advanced_api_calling_in_flutter.docx
@@ -35,10 +35,26 @@
       </w:pPr>
       <w:r>
         <w:rPr>
-          <w:sz w:val="32"/>
-          <w:szCs w:val="32"/>
-        </w:rPr>
-        <w:t>Dio……………………………………………………………………………….2</w:t>
+          <w:b/>
+          <w:bCs/>
+          <w:sz w:val="32"/>
+          <w:szCs w:val="32"/>
+        </w:rPr>
+        <w:t>Dio</w:t>
+      </w:r>
+      <w:r>
+        <w:rPr>
+          <w:sz w:val="32"/>
+          <w:szCs w:val="32"/>
+        </w:rPr>
+        <w:t xml:space="preserve"> Package</w:t>
+      </w:r>
+      <w:r>
+        <w:rPr>
+          <w:sz w:val="32"/>
+          <w:szCs w:val="32"/>
+        </w:rPr>
+        <w:t>………………………………………………………………….2</w:t>
       </w:r>
     </w:p>
     <w:p>
@@ -87,27 +103,4103 @@
       <w:pPr>
         <w:jc w:val="both"/>
         <w:rPr>
-          <w:sz w:val="32"/>
-          <w:szCs w:val="32"/>
-        </w:rPr>
-      </w:pPr>
-      <w:r>
-        <w:rPr>
+          <w:b/>
+          <w:bCs/>
+          <w:sz w:val="32"/>
+          <w:szCs w:val="32"/>
+        </w:rPr>
+      </w:pPr>
+      <w:r>
+        <w:rPr>
+          <w:b/>
+          <w:bCs/>
           <w:sz w:val="32"/>
           <w:szCs w:val="32"/>
         </w:rPr>
         <w:lastRenderedPageBreak/>
-        <w:t>Dio:</w:t>
-      </w:r>
-    </w:p>
-    <w:p>
-      <w:pPr>
-        <w:jc w:val="both"/>
-        <w:rPr>
-          <w:sz w:val="32"/>
-          <w:szCs w:val="32"/>
-        </w:rPr>
-      </w:pPr>
+        <w:t>Dio</w:t>
+      </w:r>
+      <w:r>
+        <w:rPr>
+          <w:b/>
+          <w:bCs/>
+          <w:sz w:val="32"/>
+          <w:szCs w:val="32"/>
+        </w:rPr>
+        <w:t xml:space="preserve"> Package</w:t>
+      </w:r>
+      <w:r>
+        <w:rPr>
+          <w:b/>
+          <w:bCs/>
+          <w:sz w:val="32"/>
+          <w:szCs w:val="32"/>
+        </w:rPr>
+        <w:t>:</w:t>
+      </w:r>
+    </w:p>
+    <w:p>
+      <w:pPr>
+        <w:jc w:val="both"/>
+        <w:rPr>
+          <w:sz w:val="32"/>
+          <w:szCs w:val="32"/>
+        </w:rPr>
+      </w:pPr>
+      <w:r>
+        <w:rPr>
+          <w:sz w:val="32"/>
+          <w:szCs w:val="32"/>
+        </w:rPr>
+        <w:t># Dio is a powerful HTTP client for Dart/Flutter. Think of it as http package’s more powerful version with things built-in that we had to wire manually before</w:t>
+      </w:r>
+    </w:p>
+    <w:p>
+      <w:pPr>
+        <w:jc w:val="both"/>
+        <w:rPr>
+          <w:sz w:val="32"/>
+          <w:szCs w:val="32"/>
+        </w:rPr>
+      </w:pPr>
+    </w:p>
+    <w:p>
+      <w:pPr>
+        <w:jc w:val="both"/>
+        <w:rPr>
+          <w:sz w:val="32"/>
+          <w:szCs w:val="32"/>
+        </w:rPr>
+      </w:pPr>
+      <w:r>
+        <w:rPr>
+          <w:sz w:val="32"/>
+          <w:szCs w:val="32"/>
+        </w:rPr>
+        <w:t>Why Dio over http:</w:t>
+      </w:r>
+    </w:p>
+    <w:p>
+      <w:pPr>
+        <w:jc w:val="both"/>
+        <w:rPr>
+          <w:sz w:val="32"/>
+          <w:szCs w:val="32"/>
+        </w:rPr>
+      </w:pPr>
+      <w:r>
+        <w:rPr>
+          <w:sz w:val="32"/>
+          <w:szCs w:val="32"/>
+        </w:rPr>
+        <w:t>#</w:t>
+      </w:r>
+      <w:r>
+        <w:rPr>
+          <w:sz w:val="32"/>
+          <w:szCs w:val="32"/>
+        </w:rPr>
+        <w:t xml:space="preserve"> Dio handles:</w:t>
+      </w:r>
+    </w:p>
+    <w:p>
+      <w:pPr>
+        <w:jc w:val="both"/>
+        <w:rPr>
+          <w:sz w:val="32"/>
+          <w:szCs w:val="32"/>
+        </w:rPr>
+      </w:pPr>
+      <w:r>
+        <w:rPr>
+          <w:sz w:val="32"/>
+          <w:szCs w:val="32"/>
+        </w:rPr>
+        <w:t xml:space="preserve">URL parsing </w:t>
+      </w:r>
+      <w:proofErr w:type="spellStart"/>
+      <w:r>
+        <w:rPr>
+          <w:b/>
+          <w:bCs/>
+          <w:sz w:val="32"/>
+          <w:szCs w:val="32"/>
+        </w:rPr>
+        <w:t>Uri.parse</w:t>
+      </w:r>
+      <w:proofErr w:type="spellEnd"/>
+      <w:r>
+        <w:rPr>
+          <w:b/>
+          <w:bCs/>
+          <w:sz w:val="32"/>
+          <w:szCs w:val="32"/>
+        </w:rPr>
+        <w:t>()</w:t>
+      </w:r>
+      <w:r>
+        <w:rPr>
+          <w:b/>
+          <w:bCs/>
+          <w:sz w:val="32"/>
+          <w:szCs w:val="32"/>
+        </w:rPr>
+        <w:t xml:space="preserve"> </w:t>
+      </w:r>
+      <w:r>
+        <w:rPr>
+          <w:sz w:val="32"/>
+          <w:szCs w:val="32"/>
+        </w:rPr>
+        <w:t xml:space="preserve">(using </w:t>
+      </w:r>
+      <w:proofErr w:type="spellStart"/>
+      <w:r>
+        <w:rPr>
+          <w:b/>
+          <w:bCs/>
+          <w:sz w:val="32"/>
+          <w:szCs w:val="32"/>
+        </w:rPr>
+        <w:t>baseUrl</w:t>
+      </w:r>
+      <w:proofErr w:type="spellEnd"/>
+      <w:r>
+        <w:rPr>
+          <w:b/>
+          <w:bCs/>
+          <w:sz w:val="32"/>
+          <w:szCs w:val="32"/>
+        </w:rPr>
+        <w:t>:</w:t>
+      </w:r>
+      <w:r>
+        <w:rPr>
+          <w:sz w:val="32"/>
+          <w:szCs w:val="32"/>
+        </w:rPr>
+        <w:t>)</w:t>
+      </w:r>
+    </w:p>
+    <w:p>
+      <w:pPr>
+        <w:jc w:val="both"/>
+        <w:rPr>
+          <w:sz w:val="32"/>
+          <w:szCs w:val="32"/>
+        </w:rPr>
+      </w:pPr>
+    </w:p>
+    <w:p>
+      <w:pPr>
+        <w:jc w:val="both"/>
+        <w:rPr>
+          <w:sz w:val="32"/>
+          <w:szCs w:val="32"/>
+        </w:rPr>
+      </w:pPr>
+      <w:r>
+        <w:rPr>
+          <w:sz w:val="32"/>
+          <w:szCs w:val="32"/>
+        </w:rPr>
+        <w:t># Automatically for us so we don’t have to do that manually.</w:t>
+      </w:r>
+      <w:r>
+        <w:rPr>
+          <w:sz w:val="32"/>
+          <w:szCs w:val="32"/>
+        </w:rPr>
+        <w:t xml:space="preserve"> </w:t>
+      </w:r>
+      <w:r>
+        <w:rPr>
+          <w:sz w:val="32"/>
+          <w:szCs w:val="32"/>
+        </w:rPr>
+        <w:t xml:space="preserve">For our </w:t>
+      </w:r>
+      <w:proofErr w:type="spellStart"/>
+      <w:r>
+        <w:rPr>
+          <w:b/>
+          <w:bCs/>
+          <w:sz w:val="32"/>
+          <w:szCs w:val="32"/>
+        </w:rPr>
+        <w:t>APICaller</w:t>
+      </w:r>
+      <w:proofErr w:type="spellEnd"/>
+      <w:r>
+        <w:rPr>
+          <w:sz w:val="32"/>
+          <w:szCs w:val="32"/>
+        </w:rPr>
+        <w:t xml:space="preserve"> we had to do manually:</w:t>
+      </w:r>
+    </w:p>
+    <w:p>
+      <w:pPr>
+        <w:jc w:val="both"/>
+        <w:rPr>
+          <w:b/>
+          <w:bCs/>
+          <w:sz w:val="28"/>
+          <w:szCs w:val="28"/>
+        </w:rPr>
+      </w:pPr>
+      <w:r>
+        <w:rPr>
+          <w:b/>
+          <w:bCs/>
+          <w:sz w:val="28"/>
+          <w:szCs w:val="28"/>
+        </w:rPr>
+        <w:t xml:space="preserve">http package (our current </w:t>
+      </w:r>
+      <w:proofErr w:type="gramStart"/>
+      <w:r>
+        <w:rPr>
+          <w:b/>
+          <w:bCs/>
+          <w:sz w:val="28"/>
+          <w:szCs w:val="28"/>
+        </w:rPr>
+        <w:t xml:space="preserve">code)   </w:t>
+      </w:r>
+      <w:proofErr w:type="gramEnd"/>
+      <w:r>
+        <w:rPr>
+          <w:b/>
+          <w:bCs/>
+          <w:sz w:val="28"/>
+          <w:szCs w:val="28"/>
+        </w:rPr>
+        <w:t xml:space="preserve">     Dio (what replaces it)</w:t>
+      </w:r>
+    </w:p>
+    <w:p>
+      <w:pPr>
+        <w:jc w:val="both"/>
+        <w:rPr>
+          <w:b/>
+          <w:bCs/>
+          <w:sz w:val="28"/>
+          <w:szCs w:val="28"/>
+        </w:rPr>
+      </w:pPr>
+      <w:r>
+        <w:rPr>
+          <w:b/>
+          <w:bCs/>
+          <w:sz w:val="28"/>
+          <w:szCs w:val="28"/>
+        </w:rPr>
+        <w:t>────────────────────────────────────────────────────────</w:t>
+      </w:r>
+    </w:p>
+    <w:p>
+      <w:pPr>
+        <w:jc w:val="both"/>
+        <w:rPr>
+          <w:b/>
+          <w:bCs/>
+          <w:sz w:val="28"/>
+          <w:szCs w:val="28"/>
+        </w:rPr>
+      </w:pPr>
+      <w:proofErr w:type="gramStart"/>
+      <w:r>
+        <w:rPr>
+          <w:b/>
+          <w:bCs/>
+          <w:sz w:val="28"/>
+          <w:szCs w:val="28"/>
+        </w:rPr>
+        <w:t>headers(</w:t>
+      </w:r>
+      <w:proofErr w:type="gramEnd"/>
+      <w:r>
+        <w:rPr>
+          <w:b/>
+          <w:bCs/>
+          <w:sz w:val="28"/>
+          <w:szCs w:val="28"/>
+        </w:rPr>
+        <w:t>) injected manually</w:t>
+      </w:r>
+      <w:r>
+        <w:rPr>
+          <w:b/>
+          <w:bCs/>
+          <w:sz w:val="28"/>
+          <w:szCs w:val="28"/>
+        </w:rPr>
+        <w:tab/>
+      </w:r>
+      <w:r>
+        <w:rPr>
+          <w:b/>
+          <w:bCs/>
+          <w:sz w:val="28"/>
+          <w:szCs w:val="28"/>
+        </w:rPr>
+        <w:tab/>
+      </w:r>
+      <w:r>
+        <w:rPr>
+          <w:b/>
+          <w:bCs/>
+          <w:sz w:val="28"/>
+          <w:szCs w:val="28"/>
+        </w:rPr>
+        <w:t>→</w:t>
+      </w:r>
+      <w:r>
+        <w:rPr>
+          <w:b/>
+          <w:bCs/>
+          <w:sz w:val="28"/>
+          <w:szCs w:val="28"/>
+        </w:rPr>
+        <w:t xml:space="preserve"> </w:t>
+      </w:r>
+      <w:proofErr w:type="spellStart"/>
+      <w:r>
+        <w:rPr>
+          <w:b/>
+          <w:bCs/>
+          <w:sz w:val="28"/>
+          <w:szCs w:val="28"/>
+        </w:rPr>
+        <w:t>BaseOptions.headers</w:t>
+      </w:r>
+      <w:proofErr w:type="spellEnd"/>
+      <w:r>
+        <w:rPr>
+          <w:b/>
+          <w:bCs/>
+          <w:sz w:val="28"/>
+          <w:szCs w:val="28"/>
+        </w:rPr>
+        <w:t xml:space="preserve"> (set once)</w:t>
+      </w:r>
+    </w:p>
+    <w:p>
+      <w:pPr>
+        <w:jc w:val="both"/>
+        <w:rPr>
+          <w:b/>
+          <w:bCs/>
+          <w:sz w:val="28"/>
+          <w:szCs w:val="28"/>
+        </w:rPr>
+      </w:pPr>
+      <w:proofErr w:type="gramStart"/>
+      <w:r>
+        <w:rPr>
+          <w:b/>
+          <w:bCs/>
+          <w:sz w:val="28"/>
+          <w:szCs w:val="28"/>
+        </w:rPr>
+        <w:t>.timeout</w:t>
+      </w:r>
+      <w:proofErr w:type="gramEnd"/>
+      <w:r>
+        <w:rPr>
+          <w:b/>
+          <w:bCs/>
+          <w:sz w:val="28"/>
+          <w:szCs w:val="28"/>
+        </w:rPr>
+        <w:t>() on every request</w:t>
+      </w:r>
+      <w:r>
+        <w:rPr>
+          <w:b/>
+          <w:bCs/>
+          <w:sz w:val="28"/>
+          <w:szCs w:val="28"/>
+        </w:rPr>
+        <w:tab/>
+      </w:r>
+      <w:r>
+        <w:rPr>
+          <w:b/>
+          <w:bCs/>
+          <w:sz w:val="28"/>
+          <w:szCs w:val="28"/>
+        </w:rPr>
+        <w:tab/>
+      </w:r>
+      <w:r>
+        <w:rPr>
+          <w:b/>
+          <w:bCs/>
+          <w:sz w:val="28"/>
+          <w:szCs w:val="28"/>
+        </w:rPr>
+        <w:t>→</w:t>
+      </w:r>
+      <w:r>
+        <w:rPr>
+          <w:b/>
+          <w:bCs/>
+          <w:sz w:val="28"/>
+          <w:szCs w:val="28"/>
+        </w:rPr>
+        <w:t xml:space="preserve"> </w:t>
+      </w:r>
+      <w:proofErr w:type="spellStart"/>
+      <w:r>
+        <w:rPr>
+          <w:b/>
+          <w:bCs/>
+          <w:sz w:val="28"/>
+          <w:szCs w:val="28"/>
+        </w:rPr>
+        <w:t>BaseOptions.connectTimeout</w:t>
+      </w:r>
+      <w:proofErr w:type="spellEnd"/>
+      <w:r>
+        <w:rPr>
+          <w:b/>
+          <w:bCs/>
+          <w:sz w:val="28"/>
+          <w:szCs w:val="28"/>
+        </w:rPr>
+        <w:t xml:space="preserve"> (set once)</w:t>
+      </w:r>
+    </w:p>
+    <w:p>
+      <w:pPr>
+        <w:jc w:val="both"/>
+        <w:rPr>
+          <w:b/>
+          <w:bCs/>
+          <w:sz w:val="28"/>
+          <w:szCs w:val="28"/>
+        </w:rPr>
+      </w:pPr>
+      <w:proofErr w:type="spellStart"/>
+      <w:r>
+        <w:rPr>
+          <w:b/>
+          <w:bCs/>
+          <w:sz w:val="28"/>
+          <w:szCs w:val="28"/>
+        </w:rPr>
+        <w:t>onUnauthorized</w:t>
+      </w:r>
+      <w:proofErr w:type="spellEnd"/>
+      <w:r>
+        <w:rPr>
+          <w:b/>
+          <w:bCs/>
+          <w:sz w:val="28"/>
+          <w:szCs w:val="28"/>
+        </w:rPr>
+        <w:t xml:space="preserve"> callback</w:t>
+      </w:r>
+      <w:r>
+        <w:rPr>
+          <w:b/>
+          <w:bCs/>
+          <w:sz w:val="28"/>
+          <w:szCs w:val="28"/>
+        </w:rPr>
+        <w:tab/>
+      </w:r>
+      <w:r>
+        <w:rPr>
+          <w:b/>
+          <w:bCs/>
+          <w:sz w:val="28"/>
+          <w:szCs w:val="28"/>
+        </w:rPr>
+        <w:tab/>
+      </w:r>
+      <w:r>
+        <w:rPr>
+          <w:b/>
+          <w:bCs/>
+          <w:sz w:val="28"/>
+          <w:szCs w:val="28"/>
+        </w:rPr>
+        <w:t>→</w:t>
+      </w:r>
+      <w:r>
+        <w:rPr>
+          <w:b/>
+          <w:bCs/>
+          <w:sz w:val="28"/>
+          <w:szCs w:val="28"/>
+        </w:rPr>
+        <w:t xml:space="preserve"> </w:t>
+      </w:r>
+      <w:r>
+        <w:rPr>
+          <w:b/>
+          <w:bCs/>
+          <w:sz w:val="28"/>
+          <w:szCs w:val="28"/>
+        </w:rPr>
+        <w:t>Error Interceptor (Se</w:t>
+      </w:r>
+      <w:r>
+        <w:rPr>
+          <w:b/>
+          <w:bCs/>
+          <w:sz w:val="28"/>
+          <w:szCs w:val="28"/>
+        </w:rPr>
+        <w:t>e Below</w:t>
+      </w:r>
+      <w:r>
+        <w:rPr>
+          <w:b/>
+          <w:bCs/>
+          <w:sz w:val="28"/>
+          <w:szCs w:val="28"/>
+        </w:rPr>
+        <w:t>)</w:t>
+      </w:r>
+    </w:p>
+    <w:p>
+      <w:pPr>
+        <w:jc w:val="both"/>
+        <w:rPr>
+          <w:b/>
+          <w:bCs/>
+          <w:sz w:val="28"/>
+          <w:szCs w:val="28"/>
+        </w:rPr>
+      </w:pPr>
+      <w:r>
+        <w:rPr>
+          <w:b/>
+          <w:bCs/>
+          <w:sz w:val="28"/>
+          <w:szCs w:val="28"/>
+        </w:rPr>
+        <w:t>injected</w:t>
+      </w:r>
+    </w:p>
+    <w:p>
+      <w:pPr>
+        <w:jc w:val="both"/>
+        <w:rPr>
+          <w:b/>
+          <w:bCs/>
+          <w:sz w:val="28"/>
+          <w:szCs w:val="28"/>
+        </w:rPr>
+      </w:pPr>
+      <w:proofErr w:type="spellStart"/>
+      <w:r>
+        <w:rPr>
+          <w:b/>
+          <w:bCs/>
+          <w:sz w:val="28"/>
+          <w:szCs w:val="28"/>
+        </w:rPr>
+        <w:t>debugPrint</w:t>
+      </w:r>
+      <w:proofErr w:type="spellEnd"/>
+      <w:r>
+        <w:rPr>
+          <w:b/>
+          <w:bCs/>
+          <w:sz w:val="28"/>
+          <w:szCs w:val="28"/>
+        </w:rPr>
+        <w:t xml:space="preserve"> scattered everywhere</w:t>
+      </w:r>
+      <w:r>
+        <w:rPr>
+          <w:b/>
+          <w:bCs/>
+          <w:sz w:val="28"/>
+          <w:szCs w:val="28"/>
+        </w:rPr>
+        <w:tab/>
+      </w:r>
+      <w:r>
+        <w:rPr>
+          <w:b/>
+          <w:bCs/>
+          <w:sz w:val="28"/>
+          <w:szCs w:val="28"/>
+        </w:rPr>
+        <w:t>→</w:t>
+      </w:r>
+      <w:r>
+        <w:rPr>
+          <w:b/>
+          <w:bCs/>
+          <w:sz w:val="28"/>
+          <w:szCs w:val="28"/>
+        </w:rPr>
+        <w:t xml:space="preserve"> </w:t>
+      </w:r>
+      <w:proofErr w:type="spellStart"/>
+      <w:r>
+        <w:rPr>
+          <w:b/>
+          <w:bCs/>
+          <w:sz w:val="28"/>
+          <w:szCs w:val="28"/>
+        </w:rPr>
+        <w:t>LogInterceptor</w:t>
+      </w:r>
+      <w:proofErr w:type="spellEnd"/>
+      <w:r>
+        <w:rPr>
+          <w:b/>
+          <w:bCs/>
+          <w:sz w:val="28"/>
+          <w:szCs w:val="28"/>
+        </w:rPr>
+        <w:t xml:space="preserve"> (one line)</w:t>
+      </w:r>
+    </w:p>
+    <w:p>
+      <w:pPr>
+        <w:jc w:val="both"/>
+        <w:rPr>
+          <w:b/>
+          <w:bCs/>
+          <w:sz w:val="28"/>
+          <w:szCs w:val="28"/>
+        </w:rPr>
+      </w:pPr>
+      <w:r>
+        <w:rPr>
+          <w:b/>
+          <w:bCs/>
+          <w:sz w:val="28"/>
+          <w:szCs w:val="28"/>
+        </w:rPr>
+        <w:t xml:space="preserve">catch (e) =&gt; </w:t>
+      </w:r>
+      <w:proofErr w:type="spellStart"/>
+      <w:proofErr w:type="gramStart"/>
+      <w:r>
+        <w:rPr>
+          <w:b/>
+          <w:bCs/>
+          <w:sz w:val="28"/>
+          <w:szCs w:val="28"/>
+        </w:rPr>
+        <w:t>e.toString</w:t>
+      </w:r>
+      <w:proofErr w:type="spellEnd"/>
+      <w:proofErr w:type="gramEnd"/>
+      <w:r>
+        <w:rPr>
+          <w:b/>
+          <w:bCs/>
+          <w:sz w:val="28"/>
+          <w:szCs w:val="28"/>
+        </w:rPr>
+        <w:t>()</w:t>
+      </w:r>
+      <w:r>
+        <w:rPr>
+          <w:b/>
+          <w:bCs/>
+          <w:sz w:val="28"/>
+          <w:szCs w:val="28"/>
+        </w:rPr>
+        <w:tab/>
+      </w:r>
+      <w:r>
+        <w:rPr>
+          <w:b/>
+          <w:bCs/>
+          <w:sz w:val="28"/>
+          <w:szCs w:val="28"/>
+        </w:rPr>
+        <w:tab/>
+      </w:r>
+      <w:r>
+        <w:rPr>
+          <w:b/>
+          <w:bCs/>
+          <w:sz w:val="28"/>
+          <w:szCs w:val="28"/>
+        </w:rPr>
+        <w:t xml:space="preserve">→  </w:t>
+      </w:r>
+      <w:proofErr w:type="spellStart"/>
+      <w:r>
+        <w:rPr>
+          <w:b/>
+          <w:bCs/>
+          <w:sz w:val="28"/>
+          <w:szCs w:val="28"/>
+        </w:rPr>
+        <w:t>DioException</w:t>
+      </w:r>
+      <w:proofErr w:type="spellEnd"/>
+      <w:r>
+        <w:rPr>
+          <w:b/>
+          <w:bCs/>
+          <w:sz w:val="28"/>
+          <w:szCs w:val="28"/>
+        </w:rPr>
+        <w:t xml:space="preserve"> with typed errors</w:t>
+      </w:r>
+    </w:p>
+    <w:p>
+      <w:pPr>
+        <w:jc w:val="both"/>
+        <w:rPr>
+          <w:b/>
+          <w:bCs/>
+          <w:sz w:val="28"/>
+          <w:szCs w:val="28"/>
+        </w:rPr>
+      </w:pPr>
+      <w:r>
+        <w:rPr>
+          <w:b/>
+          <w:bCs/>
+          <w:sz w:val="28"/>
+          <w:szCs w:val="28"/>
+        </w:rPr>
+        <w:t>No retry logic</w:t>
+      </w:r>
+      <w:r>
+        <w:rPr>
+          <w:b/>
+          <w:bCs/>
+          <w:sz w:val="28"/>
+          <w:szCs w:val="28"/>
+        </w:rPr>
+        <w:tab/>
+      </w:r>
+      <w:r>
+        <w:rPr>
+          <w:b/>
+          <w:bCs/>
+          <w:sz w:val="28"/>
+          <w:szCs w:val="28"/>
+        </w:rPr>
+        <w:tab/>
+      </w:r>
+      <w:r>
+        <w:rPr>
+          <w:b/>
+          <w:bCs/>
+          <w:sz w:val="28"/>
+          <w:szCs w:val="28"/>
+        </w:rPr>
+        <w:tab/>
+      </w:r>
+      <w:r>
+        <w:rPr>
+          <w:b/>
+          <w:bCs/>
+          <w:sz w:val="28"/>
+          <w:szCs w:val="28"/>
+        </w:rPr>
+        <w:tab/>
+      </w:r>
+      <w:proofErr w:type="gramStart"/>
+      <w:r>
+        <w:rPr>
+          <w:b/>
+          <w:bCs/>
+          <w:sz w:val="28"/>
+          <w:szCs w:val="28"/>
+        </w:rPr>
+        <w:t>→  Interceptors</w:t>
+      </w:r>
+      <w:proofErr w:type="gramEnd"/>
+      <w:r>
+        <w:rPr>
+          <w:b/>
+          <w:bCs/>
+          <w:sz w:val="28"/>
+          <w:szCs w:val="28"/>
+        </w:rPr>
+        <w:t xml:space="preserve"> can handle retries</w:t>
+      </w:r>
+    </w:p>
+    <w:p>
+      <w:pPr>
+        <w:jc w:val="both"/>
+        <w:rPr>
+          <w:sz w:val="32"/>
+          <w:szCs w:val="32"/>
+        </w:rPr>
+      </w:pPr>
+      <w:r>
+        <w:rPr>
+          <w:sz w:val="32"/>
+          <w:szCs w:val="32"/>
+        </w:rPr>
+        <w:t xml:space="preserve"># Our </w:t>
+      </w:r>
+      <w:proofErr w:type="spellStart"/>
+      <w:r>
+        <w:rPr>
+          <w:b/>
+          <w:bCs/>
+          <w:sz w:val="32"/>
+          <w:szCs w:val="32"/>
+        </w:rPr>
+        <w:t>APICaller</w:t>
+      </w:r>
+      <w:proofErr w:type="spellEnd"/>
+      <w:r>
+        <w:rPr>
+          <w:sz w:val="32"/>
+          <w:szCs w:val="32"/>
+        </w:rPr>
+        <w:t xml:space="preserve"> had to be a </w:t>
+      </w:r>
+      <w:proofErr w:type="spellStart"/>
+      <w:r>
+        <w:rPr>
+          <w:b/>
+          <w:bCs/>
+          <w:sz w:val="32"/>
+          <w:szCs w:val="32"/>
+        </w:rPr>
+        <w:t>GetxService</w:t>
+      </w:r>
+      <w:proofErr w:type="spellEnd"/>
+      <w:r>
+        <w:rPr>
+          <w:sz w:val="32"/>
+          <w:szCs w:val="32"/>
+        </w:rPr>
+        <w:t xml:space="preserve"> (if using </w:t>
+      </w:r>
+      <w:proofErr w:type="spellStart"/>
+      <w:r>
+        <w:rPr>
+          <w:b/>
+          <w:bCs/>
+          <w:sz w:val="32"/>
+          <w:szCs w:val="32"/>
+        </w:rPr>
+        <w:t>GetX</w:t>
+      </w:r>
+      <w:proofErr w:type="spellEnd"/>
+      <w:r>
+        <w:rPr>
+          <w:sz w:val="32"/>
+          <w:szCs w:val="32"/>
+        </w:rPr>
+        <w:t xml:space="preserve"> SM) with injected call backs just to service. Dio makes all of that unnecessary through architecture only</w:t>
+      </w:r>
+    </w:p>
+    <w:p>
+      <w:pPr>
+        <w:jc w:val="both"/>
+        <w:rPr>
+          <w:sz w:val="32"/>
+          <w:szCs w:val="32"/>
+        </w:rPr>
+      </w:pPr>
+    </w:p>
+    <w:p>
+      <w:pPr>
+        <w:jc w:val="both"/>
+        <w:rPr>
+          <w:sz w:val="32"/>
+          <w:szCs w:val="32"/>
+        </w:rPr>
+      </w:pPr>
+      <w:r>
+        <w:rPr>
+          <w:sz w:val="32"/>
+          <w:szCs w:val="32"/>
+        </w:rPr>
+        <w:lastRenderedPageBreak/>
+        <w:t>The Mental Model:</w:t>
+      </w:r>
+    </w:p>
+    <w:p>
+      <w:pPr>
+        <w:jc w:val="both"/>
+        <w:rPr>
+          <w:sz w:val="32"/>
+          <w:szCs w:val="32"/>
+        </w:rPr>
+      </w:pPr>
+      <w:r>
+        <w:rPr>
+          <w:sz w:val="32"/>
+          <w:szCs w:val="32"/>
+        </w:rPr>
+        <w:t xml:space="preserve"># </w:t>
+      </w:r>
+      <w:r>
+        <w:rPr>
+          <w:sz w:val="32"/>
+          <w:szCs w:val="32"/>
+        </w:rPr>
+        <w:t>This layered config system is the core design insight of Dio. Set it once globally, override surgically per request.</w:t>
+      </w:r>
+    </w:p>
+    <w:p>
+      <w:pPr>
+        <w:jc w:val="both"/>
+        <w:rPr>
+          <w:b/>
+          <w:bCs/>
+          <w:sz w:val="28"/>
+          <w:szCs w:val="28"/>
+        </w:rPr>
+      </w:pPr>
+      <w:r>
+        <w:rPr>
+          <w:b/>
+          <w:bCs/>
+          <w:sz w:val="28"/>
+          <w:szCs w:val="28"/>
+        </w:rPr>
+        <w:t>┌─────────────────────────────────────────────────┐</w:t>
+      </w:r>
+    </w:p>
+    <w:p>
+      <w:pPr>
+        <w:jc w:val="both"/>
+        <w:rPr>
+          <w:b/>
+          <w:bCs/>
+          <w:sz w:val="28"/>
+          <w:szCs w:val="28"/>
+        </w:rPr>
+      </w:pPr>
+      <w:r>
+        <w:rPr>
+          <w:b/>
+          <w:bCs/>
+          <w:sz w:val="28"/>
+          <w:szCs w:val="28"/>
+        </w:rPr>
+        <w:t xml:space="preserve">│              </w:t>
+      </w:r>
+      <w:r>
+        <w:rPr>
+          <w:b/>
+          <w:bCs/>
+          <w:sz w:val="28"/>
+          <w:szCs w:val="28"/>
+        </w:rPr>
+        <w:t xml:space="preserve">                     </w:t>
+      </w:r>
+      <w:r>
+        <w:rPr>
+          <w:b/>
+          <w:bCs/>
+          <w:sz w:val="28"/>
+          <w:szCs w:val="28"/>
+        </w:rPr>
+        <w:t xml:space="preserve">     Dio Instance                   </w:t>
+      </w:r>
+      <w:r>
+        <w:rPr>
+          <w:b/>
+          <w:bCs/>
+          <w:sz w:val="28"/>
+          <w:szCs w:val="28"/>
+        </w:rPr>
+        <w:t xml:space="preserve">                             </w:t>
+      </w:r>
+      <w:r>
+        <w:rPr>
+          <w:b/>
+          <w:bCs/>
+          <w:sz w:val="28"/>
+          <w:szCs w:val="28"/>
+        </w:rPr>
+        <w:t xml:space="preserve">    │</w:t>
+      </w:r>
+    </w:p>
+    <w:p>
+      <w:pPr>
+        <w:jc w:val="both"/>
+        <w:rPr>
+          <w:b/>
+          <w:bCs/>
+          <w:sz w:val="28"/>
+          <w:szCs w:val="28"/>
+        </w:rPr>
+      </w:pPr>
+      <w:r>
+        <w:rPr>
+          <w:b/>
+          <w:bCs/>
+          <w:sz w:val="28"/>
+          <w:szCs w:val="28"/>
+        </w:rPr>
+        <w:t xml:space="preserve">│                                                    </w:t>
+      </w:r>
+      <w:r>
+        <w:rPr>
+          <w:b/>
+          <w:bCs/>
+          <w:sz w:val="28"/>
+          <w:szCs w:val="28"/>
+        </w:rPr>
+        <w:t xml:space="preserve">                                                                   </w:t>
+      </w:r>
+      <w:r>
+        <w:rPr>
+          <w:b/>
+          <w:bCs/>
+          <w:sz w:val="28"/>
+          <w:szCs w:val="28"/>
+        </w:rPr>
+        <w:t xml:space="preserve"> │</w:t>
+      </w:r>
+    </w:p>
+    <w:p>
+      <w:pPr>
+        <w:jc w:val="both"/>
+        <w:rPr>
+          <w:b/>
+          <w:bCs/>
+          <w:sz w:val="28"/>
+          <w:szCs w:val="28"/>
+        </w:rPr>
+      </w:pPr>
+      <w:r>
+        <w:rPr>
+          <w:b/>
+          <w:bCs/>
+          <w:sz w:val="28"/>
+          <w:szCs w:val="28"/>
+        </w:rPr>
+        <w:t>│   ┌─────────────────────────────────────────────┐ │</w:t>
+      </w:r>
+    </w:p>
+    <w:p>
+      <w:pPr>
+        <w:jc w:val="both"/>
+        <w:rPr>
+          <w:b/>
+          <w:bCs/>
+          <w:sz w:val="28"/>
+          <w:szCs w:val="28"/>
+        </w:rPr>
+      </w:pPr>
+      <w:r>
+        <w:rPr>
+          <w:b/>
+          <w:bCs/>
+          <w:sz w:val="28"/>
+          <w:szCs w:val="28"/>
+        </w:rPr>
+        <w:t xml:space="preserve">│   │          </w:t>
+      </w:r>
+      <w:r>
+        <w:rPr>
+          <w:b/>
+          <w:bCs/>
+          <w:sz w:val="28"/>
+          <w:szCs w:val="28"/>
+        </w:rPr>
+        <w:t xml:space="preserve">            </w:t>
+      </w:r>
+      <w:r>
+        <w:rPr>
+          <w:b/>
+          <w:bCs/>
+          <w:sz w:val="28"/>
+          <w:szCs w:val="28"/>
+        </w:rPr>
+        <w:t xml:space="preserve"> </w:t>
+      </w:r>
+      <w:proofErr w:type="spellStart"/>
+      <w:r>
+        <w:rPr>
+          <w:b/>
+          <w:bCs/>
+          <w:sz w:val="28"/>
+          <w:szCs w:val="28"/>
+        </w:rPr>
+        <w:t>BaseOptions</w:t>
+      </w:r>
+      <w:proofErr w:type="spellEnd"/>
+      <w:r>
+        <w:rPr>
+          <w:b/>
+          <w:bCs/>
+          <w:sz w:val="28"/>
+          <w:szCs w:val="28"/>
+        </w:rPr>
+        <w:t xml:space="preserve"> (global </w:t>
+      </w:r>
+      <w:proofErr w:type="gramStart"/>
+      <w:r>
+        <w:rPr>
+          <w:b/>
+          <w:bCs/>
+          <w:sz w:val="28"/>
+          <w:szCs w:val="28"/>
+        </w:rPr>
+        <w:t xml:space="preserve">config)   </w:t>
+      </w:r>
+      <w:proofErr w:type="gramEnd"/>
+      <w:r>
+        <w:rPr>
+          <w:b/>
+          <w:bCs/>
+          <w:sz w:val="28"/>
+          <w:szCs w:val="28"/>
+        </w:rPr>
+        <w:t xml:space="preserve">    </w:t>
+      </w:r>
+      <w:r>
+        <w:rPr>
+          <w:b/>
+          <w:bCs/>
+          <w:sz w:val="28"/>
+          <w:szCs w:val="28"/>
+        </w:rPr>
+        <w:t xml:space="preserve">                  </w:t>
+      </w:r>
+      <w:r>
+        <w:rPr>
+          <w:b/>
+          <w:bCs/>
+          <w:sz w:val="28"/>
+          <w:szCs w:val="28"/>
+        </w:rPr>
+        <w:t xml:space="preserve"> │ </w:t>
+      </w:r>
+      <w:r>
+        <w:rPr>
+          <w:b/>
+          <w:bCs/>
+          <w:sz w:val="28"/>
+          <w:szCs w:val="28"/>
+        </w:rPr>
+        <w:t xml:space="preserve"> </w:t>
+      </w:r>
+      <w:r>
+        <w:rPr>
+          <w:b/>
+          <w:bCs/>
+          <w:sz w:val="28"/>
+          <w:szCs w:val="28"/>
+        </w:rPr>
+        <w:t>│</w:t>
+      </w:r>
+    </w:p>
+    <w:p>
+      <w:pPr>
+        <w:jc w:val="both"/>
+        <w:rPr>
+          <w:b/>
+          <w:bCs/>
+          <w:sz w:val="28"/>
+          <w:szCs w:val="28"/>
+        </w:rPr>
+      </w:pPr>
+      <w:r>
+        <w:rPr>
+          <w:b/>
+          <w:bCs/>
+          <w:sz w:val="28"/>
+          <w:szCs w:val="28"/>
+        </w:rPr>
+        <w:t xml:space="preserve">│   │ </w:t>
+      </w:r>
+      <w:r>
+        <w:rPr>
+          <w:b/>
+          <w:bCs/>
+          <w:sz w:val="28"/>
+          <w:szCs w:val="28"/>
+        </w:rPr>
+        <w:t xml:space="preserve">         </w:t>
+      </w:r>
+      <w:r>
+        <w:rPr>
+          <w:b/>
+          <w:bCs/>
+          <w:sz w:val="28"/>
+          <w:szCs w:val="28"/>
+        </w:rPr>
+        <w:t xml:space="preserve"> </w:t>
+      </w:r>
+      <w:proofErr w:type="spellStart"/>
+      <w:r>
+        <w:rPr>
+          <w:b/>
+          <w:bCs/>
+          <w:sz w:val="28"/>
+          <w:szCs w:val="28"/>
+        </w:rPr>
+        <w:t>baseUrl</w:t>
+      </w:r>
+      <w:proofErr w:type="spellEnd"/>
+      <w:r>
+        <w:rPr>
+          <w:b/>
+          <w:bCs/>
+          <w:sz w:val="28"/>
+          <w:szCs w:val="28"/>
+        </w:rPr>
+        <w:t xml:space="preserve">, timeouts, headers, </w:t>
+      </w:r>
+      <w:proofErr w:type="spellStart"/>
+      <w:r>
+        <w:rPr>
+          <w:b/>
+          <w:bCs/>
+          <w:sz w:val="28"/>
+          <w:szCs w:val="28"/>
+        </w:rPr>
+        <w:t>contentType</w:t>
+      </w:r>
+      <w:proofErr w:type="spellEnd"/>
+      <w:r>
+        <w:rPr>
+          <w:b/>
+          <w:bCs/>
+          <w:sz w:val="28"/>
+          <w:szCs w:val="28"/>
+        </w:rPr>
+        <w:t xml:space="preserve">...  </w:t>
+      </w:r>
+      <w:r>
+        <w:rPr>
+          <w:b/>
+          <w:bCs/>
+          <w:sz w:val="28"/>
+          <w:szCs w:val="28"/>
+        </w:rPr>
+        <w:t xml:space="preserve">  </w:t>
+      </w:r>
+      <w:r>
+        <w:rPr>
+          <w:b/>
+          <w:bCs/>
+          <w:sz w:val="28"/>
+          <w:szCs w:val="28"/>
+        </w:rPr>
+        <w:t>│  │</w:t>
+      </w:r>
+    </w:p>
+    <w:p>
+      <w:pPr>
+        <w:jc w:val="both"/>
+        <w:rPr>
+          <w:b/>
+          <w:bCs/>
+          <w:sz w:val="28"/>
+          <w:szCs w:val="28"/>
+        </w:rPr>
+      </w:pPr>
+      <w:r>
+        <w:rPr>
+          <w:b/>
+          <w:bCs/>
+          <w:sz w:val="28"/>
+          <w:szCs w:val="28"/>
+        </w:rPr>
+        <w:t>│   └─────────────────────────────────────────────┘  │</w:t>
+      </w:r>
+    </w:p>
+    <w:p>
+      <w:pPr>
+        <w:jc w:val="both"/>
+        <w:rPr>
+          <w:b/>
+          <w:bCs/>
+          <w:sz w:val="28"/>
+          <w:szCs w:val="28"/>
+        </w:rPr>
+      </w:pPr>
+      <w:r>
+        <w:rPr>
+          <w:b/>
+          <w:bCs/>
+          <w:sz w:val="28"/>
+          <w:szCs w:val="28"/>
+        </w:rPr>
+        <w:t xml:space="preserve">│                  </w:t>
+      </w:r>
+      <w:r>
+        <w:rPr>
+          <w:b/>
+          <w:bCs/>
+          <w:sz w:val="28"/>
+          <w:szCs w:val="28"/>
+        </w:rPr>
+        <w:t xml:space="preserve">                                 </w:t>
+      </w:r>
+      <w:r>
+        <w:rPr>
+          <w:b/>
+          <w:bCs/>
+          <w:sz w:val="28"/>
+          <w:szCs w:val="28"/>
+        </w:rPr>
+        <w:t xml:space="preserve">      │                         </w:t>
+      </w:r>
+      <w:r>
+        <w:rPr>
+          <w:b/>
+          <w:bCs/>
+          <w:sz w:val="28"/>
+          <w:szCs w:val="28"/>
+        </w:rPr>
+        <w:t xml:space="preserve">                                </w:t>
+      </w:r>
+      <w:r>
+        <w:rPr>
+          <w:b/>
+          <w:bCs/>
+          <w:sz w:val="28"/>
+          <w:szCs w:val="28"/>
+        </w:rPr>
+        <w:t xml:space="preserve">   │</w:t>
+      </w:r>
+    </w:p>
+    <w:p>
+      <w:pPr>
+        <w:jc w:val="both"/>
+        <w:rPr>
+          <w:b/>
+          <w:bCs/>
+          <w:sz w:val="28"/>
+          <w:szCs w:val="28"/>
+        </w:rPr>
+      </w:pPr>
+      <w:r>
+        <w:rPr>
+          <w:b/>
+          <w:bCs/>
+          <w:sz w:val="28"/>
+          <w:szCs w:val="28"/>
+        </w:rPr>
+        <w:t xml:space="preserve">│                        </w:t>
+      </w:r>
+      <w:r>
+        <w:rPr>
+          <w:b/>
+          <w:bCs/>
+          <w:sz w:val="28"/>
+          <w:szCs w:val="28"/>
+        </w:rPr>
+        <w:t xml:space="preserve">                                </w:t>
+      </w:r>
+      <w:r>
+        <w:rPr>
+          <w:rFonts w:ascii="Arial" w:hAnsi="Arial" w:cs="Arial"/>
+          <w:b/>
+          <w:bCs/>
+          <w:sz w:val="28"/>
+          <w:szCs w:val="28"/>
+        </w:rPr>
+        <w:t>▼</w:t>
+      </w:r>
+      <w:r>
+        <w:rPr>
+          <w:b/>
+          <w:bCs/>
+          <w:sz w:val="28"/>
+          <w:szCs w:val="28"/>
+        </w:rPr>
+        <w:t xml:space="preserve">                           </w:t>
+      </w:r>
+      <w:r>
+        <w:rPr>
+          <w:b/>
+          <w:bCs/>
+          <w:sz w:val="28"/>
+          <w:szCs w:val="28"/>
+        </w:rPr>
+        <w:t xml:space="preserve">                               </w:t>
+      </w:r>
+      <w:r>
+        <w:rPr>
+          <w:b/>
+          <w:bCs/>
+          <w:sz w:val="28"/>
+          <w:szCs w:val="28"/>
+        </w:rPr>
+        <w:t xml:space="preserve"> </w:t>
+      </w:r>
+      <w:r>
+        <w:rPr>
+          <w:rFonts w:ascii="Aptos" w:hAnsi="Aptos" w:cs="Aptos"/>
+          <w:b/>
+          <w:bCs/>
+          <w:sz w:val="28"/>
+          <w:szCs w:val="28"/>
+        </w:rPr>
+        <w:t>│</w:t>
+      </w:r>
+    </w:p>
+    <w:p>
+      <w:pPr>
+        <w:jc w:val="both"/>
+        <w:rPr>
+          <w:b/>
+          <w:bCs/>
+          <w:sz w:val="28"/>
+          <w:szCs w:val="28"/>
+        </w:rPr>
+      </w:pPr>
+      <w:r>
+        <w:rPr>
+          <w:b/>
+          <w:bCs/>
+          <w:sz w:val="28"/>
+          <w:szCs w:val="28"/>
+        </w:rPr>
+        <w:t>│   ┌─────────────────────────────────────────────┐  │</w:t>
+      </w:r>
+    </w:p>
+    <w:p>
+      <w:pPr>
+        <w:jc w:val="both"/>
+        <w:rPr>
+          <w:b/>
+          <w:bCs/>
+          <w:sz w:val="28"/>
+          <w:szCs w:val="28"/>
+        </w:rPr>
+      </w:pPr>
+      <w:r>
+        <w:rPr>
+          <w:b/>
+          <w:bCs/>
+          <w:sz w:val="28"/>
+          <w:szCs w:val="28"/>
+        </w:rPr>
+        <w:t xml:space="preserve">│   │             </w:t>
+      </w:r>
+      <w:r>
+        <w:rPr>
+          <w:b/>
+          <w:bCs/>
+          <w:sz w:val="28"/>
+          <w:szCs w:val="28"/>
+        </w:rPr>
+        <w:t xml:space="preserve">                            </w:t>
+      </w:r>
+      <w:r>
+        <w:rPr>
+          <w:b/>
+          <w:bCs/>
+          <w:sz w:val="28"/>
+          <w:szCs w:val="28"/>
+        </w:rPr>
+        <w:t xml:space="preserve"> Interceptors                    </w:t>
+      </w:r>
+      <w:r>
+        <w:rPr>
+          <w:b/>
+          <w:bCs/>
+          <w:sz w:val="28"/>
+          <w:szCs w:val="28"/>
+        </w:rPr>
+        <w:t xml:space="preserve">                     </w:t>
+      </w:r>
+      <w:proofErr w:type="gramStart"/>
+      <w:r>
+        <w:rPr>
+          <w:b/>
+          <w:bCs/>
+          <w:sz w:val="28"/>
+          <w:szCs w:val="28"/>
+        </w:rPr>
+        <w:t>│  │</w:t>
+      </w:r>
+      <w:proofErr w:type="gramEnd"/>
+      <w:r>
+        <w:rPr>
+          <w:b/>
+          <w:bCs/>
+          <w:sz w:val="28"/>
+          <w:szCs w:val="28"/>
+        </w:rPr>
+        <w:t xml:space="preserve">  ← Se</w:t>
+      </w:r>
+      <w:r>
+        <w:rPr>
+          <w:b/>
+          <w:bCs/>
+          <w:sz w:val="28"/>
+          <w:szCs w:val="28"/>
+        </w:rPr>
+        <w:t>e Below</w:t>
+      </w:r>
+    </w:p>
+    <w:p>
+      <w:pPr>
+        <w:jc w:val="both"/>
+        <w:rPr>
+          <w:b/>
+          <w:bCs/>
+          <w:sz w:val="28"/>
+          <w:szCs w:val="28"/>
+        </w:rPr>
+      </w:pPr>
+      <w:r>
+        <w:rPr>
+          <w:b/>
+          <w:bCs/>
+          <w:sz w:val="28"/>
+          <w:szCs w:val="28"/>
+        </w:rPr>
+        <w:t xml:space="preserve">│   │   </w:t>
+      </w:r>
+      <w:r>
+        <w:rPr>
+          <w:b/>
+          <w:bCs/>
+          <w:sz w:val="28"/>
+          <w:szCs w:val="28"/>
+        </w:rPr>
+        <w:t xml:space="preserve">                  </w:t>
+      </w:r>
+      <w:r>
+        <w:rPr>
+          <w:b/>
+          <w:bCs/>
+          <w:sz w:val="28"/>
+          <w:szCs w:val="28"/>
+        </w:rPr>
+        <w:t xml:space="preserve">Request → Response → Error pipeline       </w:t>
+      </w:r>
+      <w:r>
+        <w:rPr>
+          <w:b/>
+          <w:bCs/>
+          <w:sz w:val="28"/>
+          <w:szCs w:val="28"/>
+        </w:rPr>
+        <w:t xml:space="preserve"> </w:t>
+      </w:r>
+      <w:r>
+        <w:rPr>
+          <w:b/>
+          <w:bCs/>
+          <w:sz w:val="28"/>
+          <w:szCs w:val="28"/>
+        </w:rPr>
+        <w:t xml:space="preserve"> </w:t>
+      </w:r>
+      <w:proofErr w:type="gramStart"/>
+      <w:r>
+        <w:rPr>
+          <w:b/>
+          <w:bCs/>
+          <w:sz w:val="28"/>
+          <w:szCs w:val="28"/>
+        </w:rPr>
+        <w:t>│  │</w:t>
+      </w:r>
+      <w:proofErr w:type="gramEnd"/>
+    </w:p>
+    <w:p>
+      <w:pPr>
+        <w:jc w:val="both"/>
+        <w:rPr>
+          <w:b/>
+          <w:bCs/>
+          <w:sz w:val="28"/>
+          <w:szCs w:val="28"/>
+        </w:rPr>
+      </w:pPr>
+      <w:r>
+        <w:rPr>
+          <w:b/>
+          <w:bCs/>
+          <w:sz w:val="28"/>
+          <w:szCs w:val="28"/>
+        </w:rPr>
+        <w:t>│   └─────────────────────────────────────────────┘  │</w:t>
+      </w:r>
+    </w:p>
+    <w:p>
+      <w:pPr>
+        <w:jc w:val="both"/>
+        <w:rPr>
+          <w:b/>
+          <w:bCs/>
+          <w:sz w:val="28"/>
+          <w:szCs w:val="28"/>
+        </w:rPr>
+      </w:pPr>
+      <w:r>
+        <w:rPr>
+          <w:b/>
+          <w:bCs/>
+          <w:sz w:val="28"/>
+          <w:szCs w:val="28"/>
+        </w:rPr>
+        <w:t xml:space="preserve">│                       </w:t>
+      </w:r>
+      <w:r>
+        <w:rPr>
+          <w:b/>
+          <w:bCs/>
+          <w:sz w:val="28"/>
+          <w:szCs w:val="28"/>
+        </w:rPr>
+        <w:t xml:space="preserve">                                 </w:t>
+      </w:r>
+      <w:r>
+        <w:rPr>
+          <w:b/>
+          <w:bCs/>
+          <w:sz w:val="28"/>
+          <w:szCs w:val="28"/>
+        </w:rPr>
+        <w:t xml:space="preserve"> │                          </w:t>
+      </w:r>
+      <w:r>
+        <w:rPr>
+          <w:b/>
+          <w:bCs/>
+          <w:sz w:val="28"/>
+          <w:szCs w:val="28"/>
+        </w:rPr>
+        <w:t xml:space="preserve">                                 </w:t>
+      </w:r>
+      <w:r>
+        <w:rPr>
+          <w:b/>
+          <w:bCs/>
+          <w:sz w:val="28"/>
+          <w:szCs w:val="28"/>
+        </w:rPr>
+        <w:t xml:space="preserve">  │</w:t>
+      </w:r>
+    </w:p>
+    <w:p>
+      <w:pPr>
+        <w:jc w:val="both"/>
+        <w:rPr>
+          <w:b/>
+          <w:bCs/>
+          <w:sz w:val="28"/>
+          <w:szCs w:val="28"/>
+        </w:rPr>
+      </w:pPr>
+      <w:r>
+        <w:rPr>
+          <w:b/>
+          <w:bCs/>
+          <w:sz w:val="28"/>
+          <w:szCs w:val="28"/>
+        </w:rPr>
+        <w:t xml:space="preserve">│                        </w:t>
+      </w:r>
+      <w:r>
+        <w:rPr>
+          <w:b/>
+          <w:bCs/>
+          <w:sz w:val="28"/>
+          <w:szCs w:val="28"/>
+        </w:rPr>
+        <w:t xml:space="preserve">                                </w:t>
+      </w:r>
+      <w:r>
+        <w:rPr>
+          <w:rFonts w:ascii="Arial" w:hAnsi="Arial" w:cs="Arial"/>
+          <w:b/>
+          <w:bCs/>
+          <w:sz w:val="28"/>
+          <w:szCs w:val="28"/>
+        </w:rPr>
+        <w:t>▼</w:t>
+      </w:r>
+      <w:r>
+        <w:rPr>
+          <w:b/>
+          <w:bCs/>
+          <w:sz w:val="28"/>
+          <w:szCs w:val="28"/>
+        </w:rPr>
+        <w:t xml:space="preserve">                       </w:t>
+      </w:r>
+      <w:r>
+        <w:rPr>
+          <w:b/>
+          <w:bCs/>
+          <w:sz w:val="28"/>
+          <w:szCs w:val="28"/>
+        </w:rPr>
+        <w:t xml:space="preserve">                                </w:t>
+      </w:r>
+      <w:r>
+        <w:rPr>
+          <w:b/>
+          <w:bCs/>
+          <w:sz w:val="28"/>
+          <w:szCs w:val="28"/>
+        </w:rPr>
+        <w:t xml:space="preserve">     </w:t>
+      </w:r>
+      <w:r>
+        <w:rPr>
+          <w:rFonts w:ascii="Aptos" w:hAnsi="Aptos" w:cs="Aptos"/>
+          <w:b/>
+          <w:bCs/>
+          <w:sz w:val="28"/>
+          <w:szCs w:val="28"/>
+        </w:rPr>
+        <w:t>│</w:t>
+      </w:r>
+    </w:p>
+    <w:p>
+      <w:pPr>
+        <w:jc w:val="both"/>
+        <w:rPr>
+          <w:b/>
+          <w:bCs/>
+          <w:sz w:val="28"/>
+          <w:szCs w:val="28"/>
+        </w:rPr>
+      </w:pPr>
+      <w:r>
+        <w:rPr>
+          <w:b/>
+          <w:bCs/>
+          <w:sz w:val="28"/>
+          <w:szCs w:val="28"/>
+        </w:rPr>
+        <w:t>│   ┌─────────────────────────────────────────────┐  │</w:t>
+      </w:r>
+    </w:p>
+    <w:p>
+      <w:pPr>
+        <w:jc w:val="both"/>
+        <w:rPr>
+          <w:b/>
+          <w:bCs/>
+          <w:sz w:val="28"/>
+          <w:szCs w:val="28"/>
+        </w:rPr>
+      </w:pPr>
+      <w:r>
+        <w:rPr>
+          <w:b/>
+          <w:bCs/>
+          <w:sz w:val="28"/>
+          <w:szCs w:val="28"/>
+        </w:rPr>
+        <w:t xml:space="preserve">│   │         </w:t>
+      </w:r>
+      <w:r>
+        <w:rPr>
+          <w:b/>
+          <w:bCs/>
+          <w:sz w:val="28"/>
+          <w:szCs w:val="28"/>
+        </w:rPr>
+        <w:t xml:space="preserve">                     </w:t>
+      </w:r>
+      <w:r>
+        <w:rPr>
+          <w:b/>
+          <w:bCs/>
+          <w:sz w:val="28"/>
+          <w:szCs w:val="28"/>
+        </w:rPr>
+        <w:t xml:space="preserve">  </w:t>
+      </w:r>
+      <w:proofErr w:type="spellStart"/>
+      <w:r>
+        <w:rPr>
+          <w:b/>
+          <w:bCs/>
+          <w:sz w:val="28"/>
+          <w:szCs w:val="28"/>
+        </w:rPr>
+        <w:t>HttpClientAdapter</w:t>
+      </w:r>
+      <w:proofErr w:type="spellEnd"/>
+      <w:r>
+        <w:rPr>
+          <w:b/>
+          <w:bCs/>
+          <w:sz w:val="28"/>
+          <w:szCs w:val="28"/>
+        </w:rPr>
+        <w:t xml:space="preserve">                  </w:t>
+      </w:r>
+      <w:r>
+        <w:rPr>
+          <w:b/>
+          <w:bCs/>
+          <w:sz w:val="28"/>
+          <w:szCs w:val="28"/>
+        </w:rPr>
+        <w:t xml:space="preserve">                   </w:t>
+      </w:r>
+      <w:proofErr w:type="gramStart"/>
+      <w:r>
+        <w:rPr>
+          <w:b/>
+          <w:bCs/>
+          <w:sz w:val="28"/>
+          <w:szCs w:val="28"/>
+        </w:rPr>
+        <w:t>│  │</w:t>
+      </w:r>
+      <w:proofErr w:type="gramEnd"/>
+    </w:p>
+    <w:p>
+      <w:pPr>
+        <w:jc w:val="both"/>
+        <w:rPr>
+          <w:b/>
+          <w:bCs/>
+          <w:sz w:val="28"/>
+          <w:szCs w:val="28"/>
+        </w:rPr>
+      </w:pPr>
+      <w:r>
+        <w:rPr>
+          <w:b/>
+          <w:bCs/>
+          <w:sz w:val="28"/>
+          <w:szCs w:val="28"/>
+        </w:rPr>
+        <w:t xml:space="preserve">│   │  </w:t>
+      </w:r>
+      <w:r>
+        <w:rPr>
+          <w:b/>
+          <w:bCs/>
+          <w:sz w:val="28"/>
+          <w:szCs w:val="28"/>
+        </w:rPr>
+        <w:t xml:space="preserve">       </w:t>
+      </w:r>
+      <w:proofErr w:type="gramStart"/>
+      <w:r>
+        <w:rPr>
+          <w:b/>
+          <w:bCs/>
+          <w:sz w:val="28"/>
+          <w:szCs w:val="28"/>
+        </w:rPr>
+        <w:t xml:space="preserve"> </w:t>
+      </w:r>
+      <w:r>
+        <w:rPr>
+          <w:b/>
+          <w:bCs/>
+          <w:sz w:val="28"/>
+          <w:szCs w:val="28"/>
+        </w:rPr>
+        <w:t xml:space="preserve">  (</w:t>
+      </w:r>
+      <w:proofErr w:type="gramEnd"/>
+      <w:r>
+        <w:rPr>
+          <w:b/>
+          <w:bCs/>
+          <w:sz w:val="28"/>
+          <w:szCs w:val="28"/>
+        </w:rPr>
+        <w:t>the thing that actually hits the network)</w:t>
+      </w:r>
+      <w:r>
+        <w:rPr>
+          <w:b/>
+          <w:bCs/>
+          <w:sz w:val="28"/>
+          <w:szCs w:val="28"/>
+        </w:rPr>
+        <w:t xml:space="preserve">          </w:t>
+      </w:r>
+      <w:r>
+        <w:rPr>
+          <w:b/>
+          <w:bCs/>
+          <w:sz w:val="28"/>
+          <w:szCs w:val="28"/>
+        </w:rPr>
+        <w:t>│  │</w:t>
+      </w:r>
+    </w:p>
+    <w:p>
+      <w:pPr>
+        <w:jc w:val="both"/>
+        <w:rPr>
+          <w:b/>
+          <w:bCs/>
+          <w:sz w:val="28"/>
+          <w:szCs w:val="28"/>
+        </w:rPr>
+      </w:pPr>
+      <w:r>
+        <w:rPr>
+          <w:b/>
+          <w:bCs/>
+          <w:sz w:val="28"/>
+          <w:szCs w:val="28"/>
+        </w:rPr>
+        <w:t>│   └─────────────────────────────────────────────┘  │</w:t>
+      </w:r>
+    </w:p>
+    <w:p>
+      <w:pPr>
+        <w:jc w:val="both"/>
+        <w:rPr>
+          <w:b/>
+          <w:bCs/>
+          <w:sz w:val="28"/>
+          <w:szCs w:val="28"/>
+        </w:rPr>
+      </w:pPr>
+      <w:r>
+        <w:rPr>
+          <w:b/>
+          <w:bCs/>
+          <w:sz w:val="28"/>
+          <w:szCs w:val="28"/>
+        </w:rPr>
+        <w:t>└─────────────────────────────────────────────────┘</w:t>
+      </w:r>
+    </w:p>
+    <w:p>
+      <w:pPr>
+        <w:jc w:val="both"/>
+        <w:rPr>
+          <w:b/>
+          <w:bCs/>
+          <w:sz w:val="28"/>
+          <w:szCs w:val="28"/>
+        </w:rPr>
+      </w:pPr>
+      <w:r>
+        <w:rPr>
+          <w:b/>
+          <w:bCs/>
+          <w:sz w:val="28"/>
+          <w:szCs w:val="28"/>
+        </w:rPr>
+        <w:t xml:space="preserve">Each request can also carry its own </w:t>
+      </w:r>
+      <w:proofErr w:type="gramStart"/>
+      <w:r>
+        <w:rPr>
+          <w:b/>
+          <w:bCs/>
+          <w:sz w:val="28"/>
+          <w:szCs w:val="28"/>
+        </w:rPr>
+        <w:t>Options(</w:t>
+      </w:r>
+      <w:proofErr w:type="gramEnd"/>
+      <w:r>
+        <w:rPr>
+          <w:b/>
+          <w:bCs/>
+          <w:sz w:val="28"/>
+          <w:szCs w:val="28"/>
+        </w:rPr>
+        <w:t xml:space="preserve">) </w:t>
+      </w:r>
+      <w:r>
+        <w:rPr>
+          <w:b/>
+          <w:bCs/>
+          <w:sz w:val="28"/>
+          <w:szCs w:val="28"/>
+        </w:rPr>
+        <w:t>and</w:t>
+      </w:r>
+      <w:r>
+        <w:rPr>
+          <w:b/>
+          <w:bCs/>
+          <w:sz w:val="28"/>
+          <w:szCs w:val="28"/>
+        </w:rPr>
+        <w:t xml:space="preserve"> these</w:t>
+      </w:r>
+      <w:r>
+        <w:rPr>
+          <w:b/>
+          <w:bCs/>
+          <w:sz w:val="28"/>
+          <w:szCs w:val="28"/>
+        </w:rPr>
+        <w:t xml:space="preserve"> OVERRIDE or EXTEND the </w:t>
+      </w:r>
+      <w:proofErr w:type="spellStart"/>
+      <w:r>
+        <w:rPr>
+          <w:b/>
+          <w:bCs/>
+          <w:sz w:val="28"/>
+          <w:szCs w:val="28"/>
+        </w:rPr>
+        <w:t>BaseOptions</w:t>
+      </w:r>
+      <w:proofErr w:type="spellEnd"/>
+      <w:r>
+        <w:rPr>
+          <w:b/>
+          <w:bCs/>
+          <w:sz w:val="28"/>
+          <w:szCs w:val="28"/>
+        </w:rPr>
+        <w:t xml:space="preserve"> for that one call only.</w:t>
+      </w:r>
+    </w:p>
+    <w:p>
+      <w:pPr>
+        <w:jc w:val="both"/>
+        <w:rPr>
+          <w:b/>
+          <w:bCs/>
+          <w:sz w:val="28"/>
+          <w:szCs w:val="28"/>
+        </w:rPr>
+      </w:pPr>
+    </w:p>
+    <w:p>
+      <w:pPr>
+        <w:jc w:val="both"/>
+        <w:rPr>
+          <w:b/>
+          <w:bCs/>
+          <w:sz w:val="28"/>
+          <w:szCs w:val="28"/>
+        </w:rPr>
+      </w:pPr>
+      <w:proofErr w:type="spellStart"/>
+      <w:r>
+        <w:rPr>
+          <w:b/>
+          <w:bCs/>
+          <w:sz w:val="28"/>
+          <w:szCs w:val="28"/>
+        </w:rPr>
+        <w:t>BaseOptions</w:t>
+      </w:r>
+      <w:proofErr w:type="spellEnd"/>
+      <w:r>
+        <w:rPr>
+          <w:b/>
+          <w:bCs/>
+          <w:sz w:val="28"/>
+          <w:szCs w:val="28"/>
+        </w:rPr>
+        <w:tab/>
+      </w:r>
+      <w:r>
+        <w:rPr>
+          <w:b/>
+          <w:bCs/>
+          <w:sz w:val="28"/>
+          <w:szCs w:val="28"/>
+        </w:rPr>
+        <w:t>←</w:t>
+      </w:r>
+      <w:r>
+        <w:rPr>
+          <w:b/>
+          <w:bCs/>
+          <w:sz w:val="28"/>
+          <w:szCs w:val="28"/>
+        </w:rPr>
+        <w:t xml:space="preserve"> </w:t>
+      </w:r>
+      <w:r>
+        <w:rPr>
+          <w:b/>
+          <w:bCs/>
+          <w:sz w:val="28"/>
+          <w:szCs w:val="28"/>
+        </w:rPr>
+        <w:t>global defaults</w:t>
+      </w:r>
+    </w:p>
+    <w:p>
+      <w:pPr>
+        <w:jc w:val="both"/>
+        <w:rPr>
+          <w:b/>
+          <w:bCs/>
+          <w:sz w:val="28"/>
+          <w:szCs w:val="28"/>
+        </w:rPr>
+      </w:pPr>
+      <w:r>
+        <w:rPr>
+          <w:b/>
+          <w:bCs/>
+          <w:sz w:val="28"/>
+          <w:szCs w:val="28"/>
+        </w:rPr>
+        <w:t xml:space="preserve">  +</w:t>
+      </w:r>
+    </w:p>
+    <w:p>
+      <w:pPr>
+        <w:jc w:val="both"/>
+        <w:rPr>
+          <w:b/>
+          <w:bCs/>
+          <w:sz w:val="28"/>
+          <w:szCs w:val="28"/>
+        </w:rPr>
+      </w:pPr>
+      <w:proofErr w:type="gramStart"/>
+      <w:r>
+        <w:rPr>
+          <w:b/>
+          <w:bCs/>
+          <w:sz w:val="28"/>
+          <w:szCs w:val="28"/>
+        </w:rPr>
+        <w:t>Options(</w:t>
+      </w:r>
+      <w:proofErr w:type="gramEnd"/>
+      <w:r>
+        <w:rPr>
+          <w:b/>
+          <w:bCs/>
+          <w:sz w:val="28"/>
+          <w:szCs w:val="28"/>
+        </w:rPr>
+        <w:t>)</w:t>
+      </w:r>
+      <w:r>
+        <w:rPr>
+          <w:b/>
+          <w:bCs/>
+          <w:sz w:val="28"/>
+          <w:szCs w:val="28"/>
+        </w:rPr>
+        <w:tab/>
+      </w:r>
+      <w:r>
+        <w:rPr>
+          <w:b/>
+          <w:bCs/>
+          <w:sz w:val="28"/>
+          <w:szCs w:val="28"/>
+        </w:rPr>
+        <w:tab/>
+      </w:r>
+      <w:r>
+        <w:rPr>
+          <w:b/>
+          <w:bCs/>
+          <w:sz w:val="28"/>
+          <w:szCs w:val="28"/>
+        </w:rPr>
+        <w:t>←  per-request overrides</w:t>
+      </w:r>
+    </w:p>
+    <w:p>
+      <w:pPr>
+        <w:jc w:val="both"/>
+        <w:rPr>
+          <w:b/>
+          <w:bCs/>
+          <w:sz w:val="28"/>
+          <w:szCs w:val="28"/>
+        </w:rPr>
+      </w:pPr>
+      <w:r>
+        <w:rPr>
+          <w:b/>
+          <w:bCs/>
+          <w:sz w:val="28"/>
+          <w:szCs w:val="28"/>
+        </w:rPr>
+        <w:t xml:space="preserve">  =</w:t>
+      </w:r>
+    </w:p>
+    <w:p>
+      <w:pPr>
+        <w:jc w:val="both"/>
+        <w:rPr>
+          <w:b/>
+          <w:bCs/>
+          <w:sz w:val="28"/>
+          <w:szCs w:val="28"/>
+        </w:rPr>
+      </w:pPr>
+      <w:r>
+        <w:rPr>
+          <w:b/>
+          <w:bCs/>
+          <w:sz w:val="28"/>
+          <w:szCs w:val="28"/>
+        </w:rPr>
+        <w:t>Final request config</w:t>
+      </w:r>
+    </w:p>
+    <w:p>
+      <w:pPr>
+        <w:jc w:val="both"/>
+        <w:rPr>
+          <w:sz w:val="32"/>
+          <w:szCs w:val="32"/>
+        </w:rPr>
+      </w:pPr>
+    </w:p>
+    <w:p>
+      <w:pPr>
+        <w:jc w:val="both"/>
+        <w:rPr>
+          <w:sz w:val="32"/>
+          <w:szCs w:val="32"/>
+        </w:rPr>
+      </w:pPr>
+      <w:r>
+        <w:rPr>
+          <w:sz w:val="32"/>
+          <w:szCs w:val="32"/>
+        </w:rPr>
+        <w:t>Installation:</w:t>
+      </w:r>
+    </w:p>
+    <w:p>
+      <w:pPr>
+        <w:jc w:val="both"/>
+        <w:rPr>
+          <w:sz w:val="32"/>
+          <w:szCs w:val="32"/>
+        </w:rPr>
+      </w:pPr>
+      <w:r>
+        <w:rPr>
+          <w:sz w:val="32"/>
+          <w:szCs w:val="32"/>
+        </w:rPr>
+        <w:t># Run this command to install it:</w:t>
+      </w:r>
+    </w:p>
+    <w:p>
+      <w:pPr>
+        <w:jc w:val="both"/>
+        <w:rPr>
+          <w:b/>
+          <w:bCs/>
+          <w:sz w:val="32"/>
+          <w:szCs w:val="32"/>
+        </w:rPr>
+      </w:pPr>
+      <w:r>
+        <w:rPr>
+          <w:b/>
+          <w:bCs/>
+          <w:color w:val="60CAF3" w:themeColor="accent4" w:themeTint="99"/>
+          <w:sz w:val="32"/>
+          <w:szCs w:val="32"/>
+        </w:rPr>
+        <w:t xml:space="preserve">flutter pub </w:t>
+      </w:r>
+      <w:proofErr w:type="gramStart"/>
+      <w:r>
+        <w:rPr>
+          <w:b/>
+          <w:bCs/>
+          <w:color w:val="60CAF3" w:themeColor="accent4" w:themeTint="99"/>
+          <w:sz w:val="32"/>
+          <w:szCs w:val="32"/>
+        </w:rPr>
+        <w:t>add</w:t>
+      </w:r>
+      <w:proofErr w:type="gramEnd"/>
+      <w:r>
+        <w:rPr>
+          <w:b/>
+          <w:bCs/>
+          <w:color w:val="60CAF3" w:themeColor="accent4" w:themeTint="99"/>
+          <w:sz w:val="32"/>
+          <w:szCs w:val="32"/>
+        </w:rPr>
+        <w:t xml:space="preserve"> </w:t>
+      </w:r>
+      <w:proofErr w:type="spellStart"/>
+      <w:r>
+        <w:rPr>
+          <w:b/>
+          <w:bCs/>
+          <w:color w:val="60CAF3" w:themeColor="accent4" w:themeTint="99"/>
+          <w:sz w:val="32"/>
+          <w:szCs w:val="32"/>
+        </w:rPr>
+        <w:t>dio</w:t>
+      </w:r>
+      <w:proofErr w:type="spellEnd"/>
+    </w:p>
+    <w:p>
+      <w:pPr>
+        <w:jc w:val="both"/>
+        <w:rPr>
+          <w:sz w:val="32"/>
+          <w:szCs w:val="32"/>
+        </w:rPr>
+      </w:pPr>
+      <w:r>
+        <w:rPr>
+          <w:sz w:val="32"/>
+          <w:szCs w:val="32"/>
+        </w:rPr>
+        <w:t># Or manually add:</w:t>
+      </w:r>
+    </w:p>
+    <w:p>
+      <w:pPr>
+        <w:jc w:val="both"/>
+        <w:rPr>
+          <w:b/>
+          <w:bCs/>
+          <w:color w:val="D86DCB" w:themeColor="accent5" w:themeTint="99"/>
+          <w:sz w:val="32"/>
+          <w:szCs w:val="32"/>
+        </w:rPr>
+      </w:pPr>
+      <w:r>
+        <w:rPr>
+          <w:b/>
+          <w:bCs/>
+          <w:color w:val="D86DCB" w:themeColor="accent5" w:themeTint="99"/>
+          <w:sz w:val="32"/>
+          <w:szCs w:val="32"/>
+        </w:rPr>
+        <w:t>dependencies:</w:t>
+      </w:r>
+    </w:p>
+    <w:p>
+      <w:pPr>
+        <w:jc w:val="both"/>
+        <w:rPr>
+          <w:b/>
+          <w:bCs/>
+          <w:color w:val="D86DCB" w:themeColor="accent5" w:themeTint="99"/>
+          <w:sz w:val="32"/>
+          <w:szCs w:val="32"/>
+        </w:rPr>
+      </w:pPr>
+      <w:r>
+        <w:rPr>
+          <w:b/>
+          <w:bCs/>
+          <w:color w:val="D86DCB" w:themeColor="accent5" w:themeTint="99"/>
+          <w:sz w:val="32"/>
+          <w:szCs w:val="32"/>
+        </w:rPr>
+        <w:t xml:space="preserve">  </w:t>
+      </w:r>
+      <w:proofErr w:type="spellStart"/>
+      <w:r>
+        <w:rPr>
+          <w:b/>
+          <w:bCs/>
+          <w:color w:val="D86DCB" w:themeColor="accent5" w:themeTint="99"/>
+          <w:sz w:val="32"/>
+          <w:szCs w:val="32"/>
+        </w:rPr>
+        <w:t>dio</w:t>
+      </w:r>
+      <w:proofErr w:type="spellEnd"/>
+      <w:r>
+        <w:rPr>
+          <w:b/>
+          <w:bCs/>
+          <w:color w:val="D86DCB" w:themeColor="accent5" w:themeTint="99"/>
+          <w:sz w:val="32"/>
+          <w:szCs w:val="32"/>
+        </w:rPr>
+        <w:t>: ^5.11.0</w:t>
+      </w:r>
+    </w:p>
+    <w:p>
+      <w:pPr>
+        <w:jc w:val="both"/>
+        <w:rPr>
+          <w:sz w:val="32"/>
+          <w:szCs w:val="32"/>
+        </w:rPr>
+      </w:pPr>
+    </w:p>
+    <w:p>
+      <w:pPr>
+        <w:jc w:val="both"/>
+        <w:rPr>
+          <w:sz w:val="32"/>
+          <w:szCs w:val="32"/>
+        </w:rPr>
+      </w:pPr>
+      <w:r>
+        <w:rPr>
+          <w:sz w:val="32"/>
+          <w:szCs w:val="32"/>
+        </w:rPr>
+        <w:t xml:space="preserve">The Global Config Object, </w:t>
+      </w:r>
+      <w:proofErr w:type="spellStart"/>
+      <w:r>
+        <w:rPr>
+          <w:sz w:val="32"/>
+          <w:szCs w:val="32"/>
+        </w:rPr>
+        <w:t>BaseOptions</w:t>
+      </w:r>
+      <w:proofErr w:type="spellEnd"/>
+      <w:r>
+        <w:rPr>
+          <w:sz w:val="32"/>
+          <w:szCs w:val="32"/>
+        </w:rPr>
+        <w:t>:</w:t>
+      </w:r>
+    </w:p>
+    <w:p>
+      <w:pPr>
+        <w:jc w:val="both"/>
+        <w:rPr>
+          <w:b/>
+          <w:bCs/>
+          <w:sz w:val="32"/>
+          <w:szCs w:val="32"/>
+        </w:rPr>
+      </w:pPr>
+      <w:r>
+        <w:rPr>
+          <w:sz w:val="32"/>
+          <w:szCs w:val="32"/>
+        </w:rPr>
+        <w:t>#</w:t>
+      </w:r>
+      <w:r>
+        <w:rPr>
+          <w:sz w:val="32"/>
+          <w:szCs w:val="32"/>
+        </w:rPr>
+        <w:t xml:space="preserve"> Create an instance or object of</w:t>
+      </w:r>
+      <w:r>
+        <w:rPr>
+          <w:b/>
+          <w:bCs/>
+          <w:sz w:val="32"/>
+          <w:szCs w:val="32"/>
+        </w:rPr>
+        <w:t xml:space="preserve"> </w:t>
+      </w:r>
+      <w:proofErr w:type="gramStart"/>
+      <w:r>
+        <w:rPr>
+          <w:b/>
+          <w:bCs/>
+          <w:sz w:val="32"/>
+          <w:szCs w:val="32"/>
+        </w:rPr>
+        <w:t>Dio(</w:t>
+      </w:r>
+      <w:proofErr w:type="gramEnd"/>
+      <w:r>
+        <w:rPr>
+          <w:b/>
+          <w:bCs/>
+          <w:sz w:val="32"/>
+          <w:szCs w:val="32"/>
+        </w:rPr>
+        <w:t xml:space="preserve">) </w:t>
+      </w:r>
+      <w:r>
+        <w:rPr>
+          <w:sz w:val="32"/>
+          <w:szCs w:val="32"/>
+        </w:rPr>
+        <w:t xml:space="preserve">to access the Dio package properties and methods. </w:t>
+      </w:r>
+      <w:proofErr w:type="gramStart"/>
+      <w:r>
+        <w:rPr>
+          <w:b/>
+          <w:bCs/>
+          <w:sz w:val="32"/>
+          <w:szCs w:val="32"/>
+        </w:rPr>
+        <w:t>Dio(</w:t>
+      </w:r>
+      <w:proofErr w:type="gramEnd"/>
+      <w:r>
+        <w:rPr>
+          <w:b/>
+          <w:bCs/>
+          <w:sz w:val="32"/>
+          <w:szCs w:val="32"/>
+        </w:rPr>
+        <w:t>)</w:t>
+      </w:r>
+      <w:r>
+        <w:rPr>
+          <w:sz w:val="32"/>
+          <w:szCs w:val="32"/>
+        </w:rPr>
+        <w:t xml:space="preserve"> class takes an instance of </w:t>
+      </w:r>
+      <w:proofErr w:type="spellStart"/>
+      <w:r>
+        <w:rPr>
+          <w:b/>
+          <w:bCs/>
+          <w:sz w:val="32"/>
+          <w:szCs w:val="32"/>
+        </w:rPr>
+        <w:t>BaseOptions</w:t>
+      </w:r>
+      <w:proofErr w:type="spellEnd"/>
+      <w:r>
+        <w:rPr>
+          <w:b/>
+          <w:bCs/>
+          <w:sz w:val="32"/>
+          <w:szCs w:val="32"/>
+        </w:rPr>
+        <w:t>()</w:t>
+      </w:r>
+    </w:p>
+    <w:p>
+      <w:pPr>
+        <w:jc w:val="both"/>
+        <w:rPr>
+          <w:sz w:val="32"/>
+          <w:szCs w:val="32"/>
+        </w:rPr>
+      </w:pPr>
+      <w:r>
+        <w:rPr>
+          <w:sz w:val="32"/>
+          <w:szCs w:val="32"/>
+        </w:rPr>
+        <w:t xml:space="preserve"># </w:t>
+      </w:r>
+      <w:proofErr w:type="spellStart"/>
+      <w:proofErr w:type="gramStart"/>
+      <w:r>
+        <w:rPr>
+          <w:b/>
+          <w:bCs/>
+          <w:sz w:val="32"/>
+          <w:szCs w:val="32"/>
+        </w:rPr>
+        <w:t>BaseOptions</w:t>
+      </w:r>
+      <w:proofErr w:type="spellEnd"/>
+      <w:r>
+        <w:rPr>
+          <w:b/>
+          <w:bCs/>
+          <w:sz w:val="32"/>
+          <w:szCs w:val="32"/>
+        </w:rPr>
+        <w:t>(</w:t>
+      </w:r>
+      <w:proofErr w:type="gramEnd"/>
+      <w:r>
+        <w:rPr>
+          <w:b/>
+          <w:bCs/>
+          <w:sz w:val="32"/>
+          <w:szCs w:val="32"/>
+        </w:rPr>
+        <w:t>)</w:t>
+      </w:r>
+      <w:r>
+        <w:rPr>
+          <w:sz w:val="32"/>
+          <w:szCs w:val="32"/>
+        </w:rPr>
+        <w:t xml:space="preserve"> specify the global or by default configurations (base URL, headers etc.) for that </w:t>
+      </w:r>
+      <w:proofErr w:type="spellStart"/>
+      <w:r>
+        <w:rPr>
+          <w:b/>
+          <w:bCs/>
+          <w:sz w:val="32"/>
+          <w:szCs w:val="32"/>
+        </w:rPr>
+        <w:t>dio</w:t>
+      </w:r>
+      <w:proofErr w:type="spellEnd"/>
+      <w:r>
+        <w:rPr>
+          <w:sz w:val="32"/>
+          <w:szCs w:val="32"/>
+        </w:rPr>
+        <w:t xml:space="preserve"> object. So, whenever that </w:t>
+      </w:r>
+      <w:proofErr w:type="spellStart"/>
+      <w:r>
+        <w:rPr>
+          <w:b/>
+          <w:bCs/>
+          <w:sz w:val="32"/>
+          <w:szCs w:val="32"/>
+        </w:rPr>
+        <w:t>dio</w:t>
+      </w:r>
+      <w:proofErr w:type="spellEnd"/>
+      <w:r>
+        <w:rPr>
+          <w:sz w:val="32"/>
+          <w:szCs w:val="32"/>
+        </w:rPr>
+        <w:t xml:space="preserve"> object is used things like base URL, headers etc. are already specified in that object in one centralized place</w:t>
+      </w:r>
+    </w:p>
+    <w:p>
+      <w:pPr>
+        <w:jc w:val="both"/>
+        <w:rPr>
+          <w:sz w:val="32"/>
+          <w:szCs w:val="32"/>
+        </w:rPr>
+      </w:pPr>
+      <w:r>
+        <w:rPr>
+          <w:sz w:val="32"/>
+          <w:szCs w:val="32"/>
+        </w:rPr>
+        <w:t>#</w:t>
+      </w:r>
+      <w:r>
+        <w:rPr>
+          <w:b/>
+          <w:bCs/>
+          <w:sz w:val="32"/>
+          <w:szCs w:val="32"/>
+        </w:rPr>
+        <w:t xml:space="preserve"> </w:t>
+      </w:r>
+      <w:proofErr w:type="spellStart"/>
+      <w:proofErr w:type="gramStart"/>
+      <w:r>
+        <w:rPr>
+          <w:b/>
+          <w:bCs/>
+          <w:sz w:val="32"/>
+          <w:szCs w:val="32"/>
+        </w:rPr>
+        <w:t>BaseOptions</w:t>
+      </w:r>
+      <w:proofErr w:type="spellEnd"/>
+      <w:r>
+        <w:rPr>
+          <w:b/>
+          <w:bCs/>
+          <w:sz w:val="32"/>
+          <w:szCs w:val="32"/>
+        </w:rPr>
+        <w:t>(</w:t>
+      </w:r>
+      <w:proofErr w:type="gramEnd"/>
+      <w:r>
+        <w:rPr>
+          <w:b/>
+          <w:bCs/>
+          <w:sz w:val="32"/>
+          <w:szCs w:val="32"/>
+        </w:rPr>
+        <w:t>)</w:t>
+      </w:r>
+      <w:r>
+        <w:rPr>
+          <w:sz w:val="32"/>
+          <w:szCs w:val="32"/>
+        </w:rPr>
+        <w:t xml:space="preserve"> properties:</w:t>
+      </w:r>
+    </w:p>
+    <w:p>
+      <w:pPr>
+        <w:pStyle w:val="ListParagraph"/>
+        <w:numPr>
+          <w:ilvl w:val="0"/>
+          <w:numId w:val="2"/>
+        </w:numPr>
+        <w:jc w:val="both"/>
+        <w:rPr>
+          <w:sz w:val="32"/>
+          <w:szCs w:val="32"/>
+        </w:rPr>
+      </w:pPr>
+      <w:proofErr w:type="spellStart"/>
+      <w:r>
+        <w:rPr>
+          <w:b/>
+          <w:bCs/>
+          <w:sz w:val="32"/>
+          <w:szCs w:val="32"/>
+        </w:rPr>
+        <w:t>baseUr</w:t>
+      </w:r>
+      <w:r>
+        <w:rPr>
+          <w:b/>
+          <w:bCs/>
+          <w:sz w:val="32"/>
+          <w:szCs w:val="32"/>
+        </w:rPr>
+        <w:t>l</w:t>
+      </w:r>
+      <w:proofErr w:type="spellEnd"/>
+      <w:r>
+        <w:rPr>
+          <w:b/>
+          <w:bCs/>
+          <w:sz w:val="32"/>
+          <w:szCs w:val="32"/>
+        </w:rPr>
+        <w:t xml:space="preserve">: </w:t>
+      </w:r>
+      <w:r>
+        <w:rPr>
+          <w:sz w:val="32"/>
+          <w:szCs w:val="32"/>
+        </w:rPr>
+        <w:t xml:space="preserve">Set once, and now </w:t>
+      </w:r>
+      <w:r>
+        <w:rPr>
+          <w:b/>
+          <w:bCs/>
+          <w:sz w:val="32"/>
+          <w:szCs w:val="32"/>
+        </w:rPr>
+        <w:t>/users</w:t>
+      </w:r>
+      <w:r>
+        <w:rPr>
+          <w:sz w:val="32"/>
+          <w:szCs w:val="32"/>
+        </w:rPr>
+        <w:t xml:space="preserve"> becomes </w:t>
+      </w:r>
+      <w:r>
+        <w:rPr>
+          <w:b/>
+          <w:bCs/>
+          <w:sz w:val="32"/>
+          <w:szCs w:val="32"/>
+        </w:rPr>
+        <w:t xml:space="preserve">https://api.ourapp.com/users </w:t>
+      </w:r>
+      <w:r>
+        <w:rPr>
+          <w:sz w:val="32"/>
+          <w:szCs w:val="32"/>
+        </w:rPr>
+        <w:t xml:space="preserve">automatically. </w:t>
+      </w:r>
+      <w:r>
+        <w:rPr>
+          <w:sz w:val="32"/>
+          <w:szCs w:val="32"/>
+        </w:rPr>
+        <w:t xml:space="preserve">No need to </w:t>
+      </w:r>
+      <w:r>
+        <w:rPr>
+          <w:sz w:val="32"/>
+          <w:szCs w:val="32"/>
+        </w:rPr>
+        <w:lastRenderedPageBreak/>
+        <w:t>hardcode the full URL in individual requests again.</w:t>
+      </w:r>
+      <w:r>
+        <w:rPr>
+          <w:sz w:val="32"/>
+          <w:szCs w:val="32"/>
+        </w:rPr>
+        <w:t xml:space="preserve"> An</w:t>
+      </w:r>
+      <w:r>
+        <w:rPr>
+          <w:sz w:val="32"/>
+          <w:szCs w:val="32"/>
+        </w:rPr>
+        <w:t>d</w:t>
+      </w:r>
+      <w:r>
+        <w:rPr>
+          <w:sz w:val="32"/>
+          <w:szCs w:val="32"/>
+        </w:rPr>
+        <w:t xml:space="preserve"> </w:t>
+      </w:r>
+      <w:proofErr w:type="spellStart"/>
+      <w:r>
+        <w:rPr>
+          <w:b/>
+          <w:bCs/>
+          <w:sz w:val="32"/>
+          <w:szCs w:val="32"/>
+        </w:rPr>
+        <w:t>Uri.parse</w:t>
+      </w:r>
+      <w:proofErr w:type="spellEnd"/>
+      <w:r>
+        <w:rPr>
+          <w:b/>
+          <w:bCs/>
+          <w:sz w:val="32"/>
+          <w:szCs w:val="32"/>
+        </w:rPr>
+        <w:t>(…)</w:t>
+      </w:r>
+      <w:r>
+        <w:rPr>
+          <w:sz w:val="32"/>
+          <w:szCs w:val="32"/>
+        </w:rPr>
+        <w:t xml:space="preserve"> </w:t>
+      </w:r>
+      <w:r>
+        <w:rPr>
+          <w:sz w:val="32"/>
+          <w:szCs w:val="32"/>
+        </w:rPr>
+        <w:t xml:space="preserve">isn’t needed </w:t>
+      </w:r>
+      <w:r>
+        <w:rPr>
+          <w:sz w:val="32"/>
+          <w:szCs w:val="32"/>
+        </w:rPr>
+        <w:t>anymore because Dio automatically handles that for us</w:t>
+      </w:r>
+    </w:p>
+    <w:p>
+      <w:pPr>
+        <w:pStyle w:val="ListParagraph"/>
+        <w:numPr>
+          <w:ilvl w:val="0"/>
+          <w:numId w:val="2"/>
+        </w:numPr>
+        <w:jc w:val="both"/>
+        <w:rPr>
+          <w:sz w:val="32"/>
+          <w:szCs w:val="32"/>
+        </w:rPr>
+      </w:pPr>
+      <w:proofErr w:type="spellStart"/>
+      <w:r>
+        <w:rPr>
+          <w:b/>
+          <w:bCs/>
+          <w:sz w:val="32"/>
+          <w:szCs w:val="32"/>
+        </w:rPr>
+        <w:t>connectTimeout</w:t>
+      </w:r>
+      <w:proofErr w:type="spellEnd"/>
+      <w:r>
+        <w:rPr>
+          <w:b/>
+          <w:bCs/>
+          <w:sz w:val="32"/>
+          <w:szCs w:val="32"/>
+        </w:rPr>
+        <w:t xml:space="preserve">: </w:t>
+      </w:r>
+      <w:r>
+        <w:rPr>
+          <w:sz w:val="32"/>
+          <w:szCs w:val="32"/>
+        </w:rPr>
+        <w:t>Takes an instance of</w:t>
+      </w:r>
+      <w:r>
+        <w:rPr>
+          <w:b/>
+          <w:bCs/>
+          <w:sz w:val="32"/>
+          <w:szCs w:val="32"/>
+        </w:rPr>
+        <w:t xml:space="preserve"> </w:t>
+      </w:r>
+      <w:proofErr w:type="gramStart"/>
+      <w:r>
+        <w:rPr>
+          <w:b/>
+          <w:bCs/>
+          <w:sz w:val="32"/>
+          <w:szCs w:val="32"/>
+        </w:rPr>
+        <w:t>Duration(</w:t>
+      </w:r>
+      <w:proofErr w:type="gramEnd"/>
+      <w:r>
+        <w:rPr>
+          <w:b/>
+          <w:bCs/>
+          <w:sz w:val="32"/>
+          <w:szCs w:val="32"/>
+        </w:rPr>
+        <w:t>)</w:t>
+      </w:r>
+      <w:r>
+        <w:rPr>
+          <w:sz w:val="32"/>
+          <w:szCs w:val="32"/>
+        </w:rPr>
+        <w:t xml:space="preserve"> and determines h</w:t>
+      </w:r>
+      <w:r>
+        <w:rPr>
+          <w:sz w:val="32"/>
+          <w:szCs w:val="32"/>
+        </w:rPr>
+        <w:t xml:space="preserve">ow long Dio waits to establish the connection. If the server doesn't respond in </w:t>
+      </w:r>
+      <w:r>
+        <w:rPr>
+          <w:sz w:val="32"/>
+          <w:szCs w:val="32"/>
+        </w:rPr>
+        <w:t>time, then throws</w:t>
+      </w:r>
+      <w:r>
+        <w:rPr>
+          <w:sz w:val="32"/>
+          <w:szCs w:val="32"/>
+        </w:rPr>
+        <w:t xml:space="preserve"> → </w:t>
+      </w:r>
+      <w:proofErr w:type="spellStart"/>
+      <w:r>
+        <w:rPr>
+          <w:b/>
+          <w:bCs/>
+          <w:sz w:val="32"/>
+          <w:szCs w:val="32"/>
+        </w:rPr>
+        <w:t>DioExceptionType.connectionTimeout</w:t>
+      </w:r>
+      <w:proofErr w:type="spellEnd"/>
+    </w:p>
+    <w:p>
+      <w:pPr>
+        <w:pStyle w:val="ListParagraph"/>
+        <w:numPr>
+          <w:ilvl w:val="0"/>
+          <w:numId w:val="2"/>
+        </w:numPr>
+        <w:jc w:val="both"/>
+        <w:rPr>
+          <w:sz w:val="32"/>
+          <w:szCs w:val="32"/>
+        </w:rPr>
+      </w:pPr>
+      <w:proofErr w:type="spellStart"/>
+      <w:r>
+        <w:rPr>
+          <w:b/>
+          <w:bCs/>
+          <w:sz w:val="32"/>
+          <w:szCs w:val="32"/>
+        </w:rPr>
+        <w:t>receiveTimeout</w:t>
+      </w:r>
+      <w:proofErr w:type="spellEnd"/>
+      <w:r>
+        <w:rPr>
+          <w:b/>
+          <w:bCs/>
+          <w:sz w:val="32"/>
+          <w:szCs w:val="32"/>
+        </w:rPr>
+        <w:t>:</w:t>
+      </w:r>
+      <w:r>
+        <w:rPr>
+          <w:sz w:val="32"/>
+          <w:szCs w:val="32"/>
+        </w:rPr>
+        <w:t xml:space="preserve"> </w:t>
+      </w:r>
+      <w:r>
+        <w:rPr>
+          <w:sz w:val="32"/>
+          <w:szCs w:val="32"/>
+        </w:rPr>
+        <w:t>Takes an instance of</w:t>
+      </w:r>
+      <w:r>
+        <w:rPr>
+          <w:b/>
+          <w:bCs/>
+          <w:sz w:val="32"/>
+          <w:szCs w:val="32"/>
+        </w:rPr>
+        <w:t xml:space="preserve"> </w:t>
+      </w:r>
+      <w:proofErr w:type="gramStart"/>
+      <w:r>
+        <w:rPr>
+          <w:b/>
+          <w:bCs/>
+          <w:sz w:val="32"/>
+          <w:szCs w:val="32"/>
+        </w:rPr>
+        <w:t>Duration(</w:t>
+      </w:r>
+      <w:proofErr w:type="gramEnd"/>
+      <w:r>
+        <w:rPr>
+          <w:b/>
+          <w:bCs/>
+          <w:sz w:val="32"/>
+          <w:szCs w:val="32"/>
+        </w:rPr>
+        <w:t>)</w:t>
+      </w:r>
+      <w:r>
+        <w:rPr>
+          <w:sz w:val="32"/>
+          <w:szCs w:val="32"/>
+        </w:rPr>
+        <w:t xml:space="preserve"> and determines</w:t>
+      </w:r>
+      <w:r>
+        <w:rPr>
+          <w:sz w:val="32"/>
+          <w:szCs w:val="32"/>
+        </w:rPr>
+        <w:t xml:space="preserve"> h</w:t>
+      </w:r>
+      <w:r>
+        <w:rPr>
+          <w:sz w:val="32"/>
+          <w:szCs w:val="32"/>
+        </w:rPr>
+        <w:t xml:space="preserve">ow long Dio waits between bytes during the response. Not the total download time </w:t>
+      </w:r>
+      <w:r>
+        <w:rPr>
+          <w:sz w:val="32"/>
+          <w:szCs w:val="32"/>
+        </w:rPr>
+        <w:t>but</w:t>
+      </w:r>
+      <w:r>
+        <w:rPr>
+          <w:sz w:val="32"/>
+          <w:szCs w:val="32"/>
+        </w:rPr>
+        <w:t xml:space="preserve"> the idle gap between packets. If exceeded</w:t>
+      </w:r>
+      <w:r>
+        <w:rPr>
+          <w:sz w:val="32"/>
+          <w:szCs w:val="32"/>
+        </w:rPr>
+        <w:t xml:space="preserve"> then throws</w:t>
+      </w:r>
+      <w:r>
+        <w:rPr>
+          <w:sz w:val="32"/>
+          <w:szCs w:val="32"/>
+        </w:rPr>
+        <w:t xml:space="preserve"> → </w:t>
+      </w:r>
+      <w:proofErr w:type="spellStart"/>
+      <w:r>
+        <w:rPr>
+          <w:b/>
+          <w:bCs/>
+          <w:sz w:val="32"/>
+          <w:szCs w:val="32"/>
+        </w:rPr>
+        <w:t>DioExceptionType.receiveTimeout</w:t>
+      </w:r>
+      <w:proofErr w:type="spellEnd"/>
+      <w:r>
+        <w:rPr>
+          <w:sz w:val="32"/>
+          <w:szCs w:val="32"/>
+        </w:rPr>
+        <w:t>.</w:t>
+      </w:r>
+    </w:p>
+    <w:p>
+      <w:pPr>
+        <w:jc w:val="both"/>
+        <w:rPr>
+          <w:sz w:val="32"/>
+          <w:szCs w:val="32"/>
+        </w:rPr>
+      </w:pPr>
+      <w:r>
+        <w:rPr>
+          <w:sz w:val="32"/>
+          <w:szCs w:val="32"/>
+        </w:rPr>
+        <w:t># Code:</w:t>
+      </w:r>
+    </w:p>
+    <w:p>
+      <w:pPr>
+        <w:jc w:val="both"/>
+        <w:rPr>
+          <w:b/>
+          <w:bCs/>
+          <w:color w:val="D86DCB" w:themeColor="accent5" w:themeTint="99"/>
+          <w:sz w:val="32"/>
+          <w:szCs w:val="32"/>
+        </w:rPr>
+      </w:pPr>
+      <w:r>
+        <w:rPr>
+          <w:b/>
+          <w:bCs/>
+          <w:color w:val="D86DCB" w:themeColor="accent5" w:themeTint="99"/>
+          <w:sz w:val="32"/>
+          <w:szCs w:val="32"/>
+        </w:rPr>
+        <w:t xml:space="preserve">final options = </w:t>
+      </w:r>
+      <w:proofErr w:type="spellStart"/>
+      <w:proofErr w:type="gramStart"/>
+      <w:r>
+        <w:rPr>
+          <w:b/>
+          <w:bCs/>
+          <w:color w:val="D86DCB" w:themeColor="accent5" w:themeTint="99"/>
+          <w:sz w:val="32"/>
+          <w:szCs w:val="32"/>
+        </w:rPr>
+        <w:t>BaseOptions</w:t>
+      </w:r>
+      <w:proofErr w:type="spellEnd"/>
+      <w:r>
+        <w:rPr>
+          <w:b/>
+          <w:bCs/>
+          <w:color w:val="D86DCB" w:themeColor="accent5" w:themeTint="99"/>
+          <w:sz w:val="32"/>
+          <w:szCs w:val="32"/>
+        </w:rPr>
+        <w:t>(</w:t>
+      </w:r>
+      <w:proofErr w:type="gramEnd"/>
+    </w:p>
+    <w:p>
+      <w:pPr>
+        <w:jc w:val="both"/>
+        <w:rPr>
+          <w:b/>
+          <w:bCs/>
+          <w:color w:val="D86DCB" w:themeColor="accent5" w:themeTint="99"/>
+          <w:sz w:val="32"/>
+          <w:szCs w:val="32"/>
+        </w:rPr>
+      </w:pPr>
+      <w:r>
+        <w:rPr>
+          <w:b/>
+          <w:bCs/>
+          <w:color w:val="D86DCB" w:themeColor="accent5" w:themeTint="99"/>
+          <w:sz w:val="32"/>
+          <w:szCs w:val="32"/>
+        </w:rPr>
+        <w:t xml:space="preserve">  </w:t>
+      </w:r>
+      <w:proofErr w:type="spellStart"/>
+      <w:r>
+        <w:rPr>
+          <w:b/>
+          <w:bCs/>
+          <w:color w:val="D86DCB" w:themeColor="accent5" w:themeTint="99"/>
+          <w:sz w:val="32"/>
+          <w:szCs w:val="32"/>
+        </w:rPr>
+        <w:t>baseUrl</w:t>
+      </w:r>
+      <w:proofErr w:type="spellEnd"/>
+      <w:r>
+        <w:rPr>
+          <w:b/>
+          <w:bCs/>
+          <w:color w:val="D86DCB" w:themeColor="accent5" w:themeTint="99"/>
+          <w:sz w:val="32"/>
+          <w:szCs w:val="32"/>
+        </w:rPr>
+        <w:t>: 'https://api.yourapp.com</w:t>
+      </w:r>
+      <w:proofErr w:type="gramStart"/>
+      <w:r>
+        <w:rPr>
+          <w:b/>
+          <w:bCs/>
+          <w:color w:val="D86DCB" w:themeColor="accent5" w:themeTint="99"/>
+          <w:sz w:val="32"/>
+          <w:szCs w:val="32"/>
+        </w:rPr>
+        <w:t xml:space="preserve">',   </w:t>
+      </w:r>
+      <w:proofErr w:type="gramEnd"/>
+      <w:r>
+        <w:rPr>
+          <w:b/>
+          <w:bCs/>
+          <w:color w:val="D86DCB" w:themeColor="accent5" w:themeTint="99"/>
+          <w:sz w:val="32"/>
+          <w:szCs w:val="32"/>
+        </w:rPr>
+        <w:t xml:space="preserve">// </w:t>
+      </w:r>
+      <w:r>
+        <w:rPr>
+          <w:b/>
+          <w:bCs/>
+          <w:color w:val="D86DCB" w:themeColor="accent5" w:themeTint="99"/>
+          <w:sz w:val="32"/>
+          <w:szCs w:val="32"/>
+        </w:rPr>
+        <w:t>added</w:t>
+      </w:r>
+      <w:r>
+        <w:rPr>
+          <w:b/>
+          <w:bCs/>
+          <w:color w:val="D86DCB" w:themeColor="accent5" w:themeTint="99"/>
+          <w:sz w:val="32"/>
+          <w:szCs w:val="32"/>
+        </w:rPr>
+        <w:t xml:space="preserve"> to every request</w:t>
+      </w:r>
+    </w:p>
+    <w:p>
+      <w:pPr>
+        <w:jc w:val="both"/>
+        <w:rPr>
+          <w:b/>
+          <w:bCs/>
+          <w:color w:val="D86DCB" w:themeColor="accent5" w:themeTint="99"/>
+          <w:sz w:val="32"/>
+          <w:szCs w:val="32"/>
+        </w:rPr>
+      </w:pPr>
+      <w:r>
+        <w:rPr>
+          <w:b/>
+          <w:bCs/>
+          <w:color w:val="D86DCB" w:themeColor="accent5" w:themeTint="99"/>
+          <w:sz w:val="32"/>
+          <w:szCs w:val="32"/>
+        </w:rPr>
+        <w:t xml:space="preserve">  </w:t>
+      </w:r>
+      <w:proofErr w:type="spellStart"/>
+      <w:r>
+        <w:rPr>
+          <w:b/>
+          <w:bCs/>
+          <w:color w:val="D86DCB" w:themeColor="accent5" w:themeTint="99"/>
+          <w:sz w:val="32"/>
+          <w:szCs w:val="32"/>
+        </w:rPr>
+        <w:t>connectTimeout</w:t>
+      </w:r>
+      <w:proofErr w:type="spellEnd"/>
+      <w:r>
+        <w:rPr>
+          <w:b/>
+          <w:bCs/>
+          <w:color w:val="D86DCB" w:themeColor="accent5" w:themeTint="99"/>
+          <w:sz w:val="32"/>
+          <w:szCs w:val="32"/>
+        </w:rPr>
+        <w:t xml:space="preserve">: </w:t>
+      </w:r>
+      <w:proofErr w:type="gramStart"/>
+      <w:r>
+        <w:rPr>
+          <w:b/>
+          <w:bCs/>
+          <w:color w:val="D86DCB" w:themeColor="accent5" w:themeTint="99"/>
+          <w:sz w:val="32"/>
+          <w:szCs w:val="32"/>
+        </w:rPr>
+        <w:t>Duration(</w:t>
+      </w:r>
+      <w:proofErr w:type="gramEnd"/>
+      <w:r>
+        <w:rPr>
+          <w:b/>
+          <w:bCs/>
+          <w:color w:val="D86DCB" w:themeColor="accent5" w:themeTint="99"/>
+          <w:sz w:val="32"/>
+          <w:szCs w:val="32"/>
+        </w:rPr>
+        <w:t>seconds: 10),</w:t>
+      </w:r>
+      <w:r>
+        <w:rPr>
+          <w:b/>
+          <w:bCs/>
+          <w:color w:val="D86DCB" w:themeColor="accent5" w:themeTint="99"/>
+          <w:sz w:val="32"/>
+          <w:szCs w:val="32"/>
+        </w:rPr>
+        <w:t xml:space="preserve"> </w:t>
+      </w:r>
+      <w:r>
+        <w:rPr>
+          <w:b/>
+          <w:bCs/>
+          <w:color w:val="D86DCB" w:themeColor="accent5" w:themeTint="99"/>
+          <w:sz w:val="32"/>
+          <w:szCs w:val="32"/>
+        </w:rPr>
+        <w:t>// time to establish connection</w:t>
+      </w:r>
+    </w:p>
+    <w:p>
+      <w:pPr>
+        <w:jc w:val="both"/>
+        <w:rPr>
+          <w:b/>
+          <w:bCs/>
+          <w:color w:val="D86DCB" w:themeColor="accent5" w:themeTint="99"/>
+          <w:sz w:val="32"/>
+          <w:szCs w:val="32"/>
+        </w:rPr>
+      </w:pPr>
+      <w:r>
+        <w:rPr>
+          <w:b/>
+          <w:bCs/>
+          <w:color w:val="D86DCB" w:themeColor="accent5" w:themeTint="99"/>
+          <w:sz w:val="32"/>
+          <w:szCs w:val="32"/>
+        </w:rPr>
+        <w:t xml:space="preserve">  </w:t>
+      </w:r>
+      <w:proofErr w:type="spellStart"/>
+      <w:r>
+        <w:rPr>
+          <w:b/>
+          <w:bCs/>
+          <w:color w:val="D86DCB" w:themeColor="accent5" w:themeTint="99"/>
+          <w:sz w:val="32"/>
+          <w:szCs w:val="32"/>
+        </w:rPr>
+        <w:t>receiveTimeout</w:t>
+      </w:r>
+      <w:proofErr w:type="spellEnd"/>
+      <w:r>
+        <w:rPr>
+          <w:b/>
+          <w:bCs/>
+          <w:color w:val="D86DCB" w:themeColor="accent5" w:themeTint="99"/>
+          <w:sz w:val="32"/>
+          <w:szCs w:val="32"/>
+        </w:rPr>
+        <w:t xml:space="preserve">: </w:t>
+      </w:r>
+      <w:proofErr w:type="gramStart"/>
+      <w:r>
+        <w:rPr>
+          <w:b/>
+          <w:bCs/>
+          <w:color w:val="D86DCB" w:themeColor="accent5" w:themeTint="99"/>
+          <w:sz w:val="32"/>
+          <w:szCs w:val="32"/>
+        </w:rPr>
+        <w:t>Duration(</w:t>
+      </w:r>
+      <w:proofErr w:type="gramEnd"/>
+      <w:r>
+        <w:rPr>
+          <w:b/>
+          <w:bCs/>
+          <w:color w:val="D86DCB" w:themeColor="accent5" w:themeTint="99"/>
+          <w:sz w:val="32"/>
+          <w:szCs w:val="32"/>
+        </w:rPr>
+        <w:t>seconds: 15),</w:t>
+      </w:r>
+      <w:r>
+        <w:rPr>
+          <w:b/>
+          <w:bCs/>
+          <w:color w:val="D86DCB" w:themeColor="accent5" w:themeTint="99"/>
+          <w:sz w:val="32"/>
+          <w:szCs w:val="32"/>
+        </w:rPr>
+        <w:t xml:space="preserve"> </w:t>
+      </w:r>
+      <w:r>
+        <w:rPr>
+          <w:b/>
+          <w:bCs/>
+          <w:color w:val="D86DCB" w:themeColor="accent5" w:themeTint="99"/>
+          <w:sz w:val="32"/>
+          <w:szCs w:val="32"/>
+        </w:rPr>
+        <w:t>// time to receive response</w:t>
+      </w:r>
+    </w:p>
+    <w:p>
+      <w:pPr>
+        <w:jc w:val="both"/>
+        <w:rPr>
+          <w:b/>
+          <w:bCs/>
+          <w:color w:val="D86DCB" w:themeColor="accent5" w:themeTint="99"/>
+          <w:sz w:val="32"/>
+          <w:szCs w:val="32"/>
+        </w:rPr>
+      </w:pPr>
+      <w:r>
+        <w:rPr>
+          <w:b/>
+          <w:bCs/>
+          <w:color w:val="D86DCB" w:themeColor="accent5" w:themeTint="99"/>
+          <w:sz w:val="32"/>
+          <w:szCs w:val="32"/>
+        </w:rPr>
+        <w:t xml:space="preserve">  headers: {</w:t>
+      </w:r>
+    </w:p>
+    <w:p>
+      <w:pPr>
+        <w:jc w:val="both"/>
+        <w:rPr>
+          <w:b/>
+          <w:bCs/>
+          <w:color w:val="D86DCB" w:themeColor="accent5" w:themeTint="99"/>
+          <w:sz w:val="32"/>
+          <w:szCs w:val="32"/>
+        </w:rPr>
+      </w:pPr>
+      <w:r>
+        <w:rPr>
+          <w:b/>
+          <w:bCs/>
+          <w:color w:val="D86DCB" w:themeColor="accent5" w:themeTint="99"/>
+          <w:sz w:val="32"/>
+          <w:szCs w:val="32"/>
+        </w:rPr>
+        <w:t xml:space="preserve">    'Content-Type': 'application/</w:t>
+      </w:r>
+      <w:proofErr w:type="spellStart"/>
+      <w:r>
+        <w:rPr>
+          <w:b/>
+          <w:bCs/>
+          <w:color w:val="D86DCB" w:themeColor="accent5" w:themeTint="99"/>
+          <w:sz w:val="32"/>
+          <w:szCs w:val="32"/>
+        </w:rPr>
+        <w:t>json</w:t>
+      </w:r>
+      <w:proofErr w:type="spellEnd"/>
+      <w:r>
+        <w:rPr>
+          <w:b/>
+          <w:bCs/>
+          <w:color w:val="D86DCB" w:themeColor="accent5" w:themeTint="99"/>
+          <w:sz w:val="32"/>
+          <w:szCs w:val="32"/>
+        </w:rPr>
+        <w:t>',</w:t>
+      </w:r>
+    </w:p>
+    <w:p>
+      <w:pPr>
+        <w:jc w:val="both"/>
+        <w:rPr>
+          <w:b/>
+          <w:bCs/>
+          <w:color w:val="D86DCB" w:themeColor="accent5" w:themeTint="99"/>
+          <w:sz w:val="32"/>
+          <w:szCs w:val="32"/>
+        </w:rPr>
+      </w:pPr>
+      <w:r>
+        <w:rPr>
+          <w:b/>
+          <w:bCs/>
+          <w:color w:val="D86DCB" w:themeColor="accent5" w:themeTint="99"/>
+          <w:sz w:val="32"/>
+          <w:szCs w:val="32"/>
+        </w:rPr>
+        <w:t xml:space="preserve">    'Accept': 'application/</w:t>
+      </w:r>
+      <w:proofErr w:type="spellStart"/>
+      <w:r>
+        <w:rPr>
+          <w:b/>
+          <w:bCs/>
+          <w:color w:val="D86DCB" w:themeColor="accent5" w:themeTint="99"/>
+          <w:sz w:val="32"/>
+          <w:szCs w:val="32"/>
+        </w:rPr>
+        <w:t>json</w:t>
+      </w:r>
+      <w:proofErr w:type="spellEnd"/>
+      <w:r>
+        <w:rPr>
+          <w:b/>
+          <w:bCs/>
+          <w:color w:val="D86DCB" w:themeColor="accent5" w:themeTint="99"/>
+          <w:sz w:val="32"/>
+          <w:szCs w:val="32"/>
+        </w:rPr>
+        <w:t>',</w:t>
+      </w:r>
+    </w:p>
+    <w:p>
+      <w:pPr>
+        <w:jc w:val="both"/>
+        <w:rPr>
+          <w:b/>
+          <w:bCs/>
+          <w:color w:val="D86DCB" w:themeColor="accent5" w:themeTint="99"/>
+          <w:sz w:val="32"/>
+          <w:szCs w:val="32"/>
+        </w:rPr>
+      </w:pPr>
+      <w:r>
+        <w:rPr>
+          <w:b/>
+          <w:bCs/>
+          <w:color w:val="D86DCB" w:themeColor="accent5" w:themeTint="99"/>
+          <w:sz w:val="32"/>
+          <w:szCs w:val="32"/>
+        </w:rPr>
+        <w:t xml:space="preserve">  },</w:t>
+      </w:r>
+    </w:p>
+    <w:p>
+      <w:pPr>
+        <w:jc w:val="both"/>
+        <w:rPr>
+          <w:b/>
+          <w:bCs/>
+          <w:color w:val="D86DCB" w:themeColor="accent5" w:themeTint="99"/>
+          <w:sz w:val="32"/>
+          <w:szCs w:val="32"/>
+        </w:rPr>
+      </w:pPr>
+      <w:r>
+        <w:rPr>
+          <w:b/>
+          <w:bCs/>
+          <w:color w:val="D86DCB" w:themeColor="accent5" w:themeTint="99"/>
+          <w:sz w:val="32"/>
+          <w:szCs w:val="32"/>
+        </w:rPr>
+        <w:t>);</w:t>
+      </w:r>
+    </w:p>
+    <w:p>
+      <w:pPr>
+        <w:jc w:val="both"/>
+        <w:rPr>
+          <w:b/>
+          <w:bCs/>
+          <w:color w:val="D86DCB" w:themeColor="accent5" w:themeTint="99"/>
+          <w:sz w:val="32"/>
+          <w:szCs w:val="32"/>
+        </w:rPr>
+      </w:pPr>
+      <w:r>
+        <w:rPr>
+          <w:b/>
+          <w:bCs/>
+          <w:color w:val="D86DCB" w:themeColor="accent5" w:themeTint="99"/>
+          <w:sz w:val="32"/>
+          <w:szCs w:val="32"/>
+        </w:rPr>
+        <w:t xml:space="preserve">final </w:t>
+      </w:r>
+      <w:proofErr w:type="spellStart"/>
+      <w:r>
+        <w:rPr>
+          <w:b/>
+          <w:bCs/>
+          <w:color w:val="D86DCB" w:themeColor="accent5" w:themeTint="99"/>
+          <w:sz w:val="32"/>
+          <w:szCs w:val="32"/>
+        </w:rPr>
+        <w:t>dio</w:t>
+      </w:r>
+      <w:proofErr w:type="spellEnd"/>
+      <w:r>
+        <w:rPr>
+          <w:b/>
+          <w:bCs/>
+          <w:color w:val="D86DCB" w:themeColor="accent5" w:themeTint="99"/>
+          <w:sz w:val="32"/>
+          <w:szCs w:val="32"/>
+        </w:rPr>
+        <w:t xml:space="preserve"> = Dio(options);</w:t>
+      </w:r>
+    </w:p>
+    <w:p>
+      <w:pPr>
+        <w:jc w:val="both"/>
+        <w:rPr>
+          <w:sz w:val="32"/>
+          <w:szCs w:val="32"/>
+        </w:rPr>
+      </w:pPr>
+      <w:r>
+        <w:rPr>
+          <w:sz w:val="32"/>
+          <w:szCs w:val="32"/>
+        </w:rPr>
+        <w:lastRenderedPageBreak/>
+        <w:t># Also by default configs (</w:t>
+      </w:r>
+      <w:proofErr w:type="spellStart"/>
+      <w:proofErr w:type="gramStart"/>
+      <w:r>
+        <w:rPr>
+          <w:b/>
+          <w:bCs/>
+          <w:sz w:val="32"/>
+          <w:szCs w:val="32"/>
+        </w:rPr>
+        <w:t>BaseOptions</w:t>
+      </w:r>
+      <w:proofErr w:type="spellEnd"/>
+      <w:r>
+        <w:rPr>
+          <w:b/>
+          <w:bCs/>
+          <w:sz w:val="32"/>
+          <w:szCs w:val="32"/>
+        </w:rPr>
+        <w:t>(</w:t>
+      </w:r>
+      <w:proofErr w:type="gramEnd"/>
+      <w:r>
+        <w:rPr>
+          <w:b/>
+          <w:bCs/>
+          <w:sz w:val="32"/>
+          <w:szCs w:val="32"/>
+        </w:rPr>
+        <w:t>)</w:t>
+      </w:r>
+      <w:r>
+        <w:rPr>
+          <w:sz w:val="32"/>
+          <w:szCs w:val="32"/>
+        </w:rPr>
+        <w:t xml:space="preserve">) can be set or changed after creation of the instance of </w:t>
+      </w:r>
+      <w:r>
+        <w:rPr>
+          <w:b/>
+          <w:bCs/>
+          <w:sz w:val="32"/>
+          <w:szCs w:val="32"/>
+        </w:rPr>
+        <w:t>Dio()</w:t>
+      </w:r>
+      <w:r>
+        <w:rPr>
+          <w:sz w:val="32"/>
+          <w:szCs w:val="32"/>
+        </w:rPr>
+        <w:t xml:space="preserve">. </w:t>
+      </w:r>
+      <w:proofErr w:type="gramStart"/>
+      <w:r>
+        <w:rPr>
+          <w:sz w:val="32"/>
+          <w:szCs w:val="32"/>
+        </w:rPr>
+        <w:t xml:space="preserve">Using </w:t>
+      </w:r>
+      <w:r>
+        <w:rPr>
+          <w:b/>
+          <w:bCs/>
+          <w:sz w:val="32"/>
+          <w:szCs w:val="32"/>
+        </w:rPr>
+        <w:t>.options</w:t>
+      </w:r>
+      <w:proofErr w:type="gramEnd"/>
+      <w:r>
+        <w:rPr>
+          <w:sz w:val="32"/>
+          <w:szCs w:val="32"/>
+        </w:rPr>
+        <w:t xml:space="preserve"> property of that instance (</w:t>
+      </w:r>
+      <w:proofErr w:type="spellStart"/>
+      <w:r>
+        <w:rPr>
+          <w:b/>
+          <w:bCs/>
+          <w:sz w:val="32"/>
+          <w:szCs w:val="32"/>
+        </w:rPr>
+        <w:t>dio.options</w:t>
+      </w:r>
+      <w:proofErr w:type="spellEnd"/>
+      <w:r>
+        <w:rPr>
+          <w:sz w:val="32"/>
+          <w:szCs w:val="32"/>
+        </w:rPr>
+        <w:t xml:space="preserve"> gives access to </w:t>
+      </w:r>
+      <w:r>
+        <w:rPr>
+          <w:b/>
+          <w:bCs/>
+          <w:sz w:val="32"/>
+          <w:szCs w:val="32"/>
+        </w:rPr>
+        <w:t>.</w:t>
+      </w:r>
+      <w:proofErr w:type="spellStart"/>
+      <w:r>
+        <w:rPr>
+          <w:b/>
+          <w:bCs/>
+          <w:sz w:val="32"/>
+          <w:szCs w:val="32"/>
+        </w:rPr>
+        <w:t>baseUrl</w:t>
+      </w:r>
+      <w:proofErr w:type="spellEnd"/>
+      <w:r>
+        <w:rPr>
+          <w:sz w:val="32"/>
+          <w:szCs w:val="32"/>
+        </w:rPr>
+        <w:t xml:space="preserve">, </w:t>
+      </w:r>
+      <w:r>
+        <w:rPr>
+          <w:b/>
+          <w:bCs/>
+          <w:sz w:val="32"/>
+          <w:szCs w:val="32"/>
+        </w:rPr>
+        <w:t>.</w:t>
+      </w:r>
+      <w:proofErr w:type="spellStart"/>
+      <w:r>
+        <w:rPr>
+          <w:b/>
+          <w:bCs/>
+          <w:sz w:val="32"/>
+          <w:szCs w:val="32"/>
+        </w:rPr>
+        <w:t>connectTimeout</w:t>
+      </w:r>
+      <w:proofErr w:type="spellEnd"/>
+      <w:r>
+        <w:rPr>
+          <w:sz w:val="32"/>
+          <w:szCs w:val="32"/>
+        </w:rPr>
+        <w:t xml:space="preserve"> etc. to set/change them)</w:t>
+      </w:r>
+    </w:p>
+    <w:p>
+      <w:pPr>
+        <w:jc w:val="both"/>
+        <w:rPr>
+          <w:b/>
+          <w:bCs/>
+          <w:color w:val="D86DCB" w:themeColor="accent5" w:themeTint="99"/>
+          <w:sz w:val="32"/>
+          <w:szCs w:val="32"/>
+        </w:rPr>
+      </w:pPr>
+      <w:r>
+        <w:rPr>
+          <w:b/>
+          <w:bCs/>
+          <w:color w:val="D86DCB" w:themeColor="accent5" w:themeTint="99"/>
+          <w:sz w:val="32"/>
+          <w:szCs w:val="32"/>
+        </w:rPr>
+        <w:t xml:space="preserve">final </w:t>
+      </w:r>
+      <w:proofErr w:type="spellStart"/>
+      <w:r>
+        <w:rPr>
+          <w:b/>
+          <w:bCs/>
+          <w:color w:val="D86DCB" w:themeColor="accent5" w:themeTint="99"/>
+          <w:sz w:val="32"/>
+          <w:szCs w:val="32"/>
+        </w:rPr>
+        <w:t>dio</w:t>
+      </w:r>
+      <w:proofErr w:type="spellEnd"/>
+      <w:r>
+        <w:rPr>
+          <w:b/>
+          <w:bCs/>
+          <w:color w:val="D86DCB" w:themeColor="accent5" w:themeTint="99"/>
+          <w:sz w:val="32"/>
+          <w:szCs w:val="32"/>
+        </w:rPr>
+        <w:t xml:space="preserve"> = </w:t>
+      </w:r>
+      <w:proofErr w:type="gramStart"/>
+      <w:r>
+        <w:rPr>
+          <w:b/>
+          <w:bCs/>
+          <w:color w:val="D86DCB" w:themeColor="accent5" w:themeTint="99"/>
+          <w:sz w:val="32"/>
+          <w:szCs w:val="32"/>
+        </w:rPr>
+        <w:t>Dio(</w:t>
+      </w:r>
+      <w:proofErr w:type="gramEnd"/>
+      <w:r>
+        <w:rPr>
+          <w:b/>
+          <w:bCs/>
+          <w:color w:val="D86DCB" w:themeColor="accent5" w:themeTint="99"/>
+          <w:sz w:val="32"/>
+          <w:szCs w:val="32"/>
+        </w:rPr>
+        <w:t>);</w:t>
+      </w:r>
+    </w:p>
+    <w:p>
+      <w:pPr>
+        <w:jc w:val="both"/>
+        <w:rPr>
+          <w:b/>
+          <w:bCs/>
+          <w:color w:val="D86DCB" w:themeColor="accent5" w:themeTint="99"/>
+          <w:sz w:val="32"/>
+          <w:szCs w:val="32"/>
+        </w:rPr>
+      </w:pPr>
+      <w:proofErr w:type="spellStart"/>
+      <w:proofErr w:type="gramStart"/>
+      <w:r>
+        <w:rPr>
+          <w:b/>
+          <w:bCs/>
+          <w:color w:val="D86DCB" w:themeColor="accent5" w:themeTint="99"/>
+          <w:sz w:val="32"/>
+          <w:szCs w:val="32"/>
+        </w:rPr>
+        <w:t>dio.options</w:t>
+      </w:r>
+      <w:proofErr w:type="gramEnd"/>
+      <w:r>
+        <w:rPr>
+          <w:b/>
+          <w:bCs/>
+          <w:color w:val="D86DCB" w:themeColor="accent5" w:themeTint="99"/>
+          <w:sz w:val="32"/>
+          <w:szCs w:val="32"/>
+        </w:rPr>
+        <w:t>.baseUrl</w:t>
+      </w:r>
+      <w:proofErr w:type="spellEnd"/>
+      <w:r>
+        <w:rPr>
+          <w:b/>
+          <w:bCs/>
+          <w:color w:val="D86DCB" w:themeColor="accent5" w:themeTint="99"/>
+          <w:sz w:val="32"/>
+          <w:szCs w:val="32"/>
+        </w:rPr>
+        <w:t xml:space="preserve"> = 'https://api.yourapp.com';</w:t>
+      </w:r>
+    </w:p>
+    <w:p>
+      <w:pPr>
+        <w:jc w:val="both"/>
+        <w:rPr>
+          <w:b/>
+          <w:bCs/>
+          <w:color w:val="D86DCB" w:themeColor="accent5" w:themeTint="99"/>
+          <w:sz w:val="32"/>
+          <w:szCs w:val="32"/>
+        </w:rPr>
+      </w:pPr>
+      <w:proofErr w:type="spellStart"/>
+      <w:proofErr w:type="gramStart"/>
+      <w:r>
+        <w:rPr>
+          <w:b/>
+          <w:bCs/>
+          <w:color w:val="D86DCB" w:themeColor="accent5" w:themeTint="99"/>
+          <w:sz w:val="32"/>
+          <w:szCs w:val="32"/>
+        </w:rPr>
+        <w:t>dio.options</w:t>
+      </w:r>
+      <w:proofErr w:type="gramEnd"/>
+      <w:r>
+        <w:rPr>
+          <w:b/>
+          <w:bCs/>
+          <w:color w:val="D86DCB" w:themeColor="accent5" w:themeTint="99"/>
+          <w:sz w:val="32"/>
+          <w:szCs w:val="32"/>
+        </w:rPr>
+        <w:t>.connectTimeout</w:t>
+      </w:r>
+      <w:proofErr w:type="spellEnd"/>
+      <w:r>
+        <w:rPr>
+          <w:b/>
+          <w:bCs/>
+          <w:color w:val="D86DCB" w:themeColor="accent5" w:themeTint="99"/>
+          <w:sz w:val="32"/>
+          <w:szCs w:val="32"/>
+        </w:rPr>
+        <w:t xml:space="preserve"> = Duration(seconds: 10);</w:t>
+      </w:r>
+    </w:p>
+    <w:p>
+      <w:pPr>
+        <w:jc w:val="both"/>
+        <w:rPr>
+          <w:sz w:val="32"/>
+          <w:szCs w:val="32"/>
+        </w:rPr>
+      </w:pPr>
+      <w:r>
+        <w:rPr>
+          <w:sz w:val="32"/>
+          <w:szCs w:val="32"/>
+        </w:rPr>
+        <w:t xml:space="preserve"># Both approaches work but </w:t>
+      </w:r>
+      <w:proofErr w:type="spellStart"/>
+      <w:proofErr w:type="gramStart"/>
+      <w:r>
+        <w:rPr>
+          <w:b/>
+          <w:bCs/>
+          <w:sz w:val="32"/>
+          <w:szCs w:val="32"/>
+        </w:rPr>
+        <w:t>BaseOptions</w:t>
+      </w:r>
+      <w:proofErr w:type="spellEnd"/>
+      <w:r>
+        <w:rPr>
+          <w:b/>
+          <w:bCs/>
+          <w:sz w:val="32"/>
+          <w:szCs w:val="32"/>
+        </w:rPr>
+        <w:t>(</w:t>
+      </w:r>
+      <w:proofErr w:type="gramEnd"/>
+      <w:r>
+        <w:rPr>
+          <w:sz w:val="32"/>
+          <w:szCs w:val="32"/>
+        </w:rPr>
+        <w:t xml:space="preserve">) in </w:t>
+      </w:r>
+      <w:r>
+        <w:rPr>
+          <w:b/>
+          <w:bCs/>
+          <w:sz w:val="32"/>
+          <w:szCs w:val="32"/>
+        </w:rPr>
+        <w:t xml:space="preserve">Dio() </w:t>
+      </w:r>
+      <w:r>
+        <w:rPr>
+          <w:sz w:val="32"/>
+          <w:szCs w:val="32"/>
+        </w:rPr>
+        <w:t>constructor is cleaner for a singleton setup</w:t>
+      </w:r>
+    </w:p>
+    <w:p>
+      <w:pPr>
+        <w:jc w:val="both"/>
+        <w:rPr>
+          <w:sz w:val="32"/>
+          <w:szCs w:val="32"/>
+        </w:rPr>
+      </w:pPr>
+    </w:p>
+    <w:p>
+      <w:pPr>
+        <w:jc w:val="both"/>
+        <w:rPr>
+          <w:sz w:val="32"/>
+          <w:szCs w:val="32"/>
+        </w:rPr>
+      </w:pPr>
+      <w:r>
+        <w:rPr>
+          <w:sz w:val="32"/>
+          <w:szCs w:val="32"/>
+        </w:rPr>
+        <w:t xml:space="preserve">Making Requests Using </w:t>
+      </w:r>
+      <w:proofErr w:type="spellStart"/>
+      <w:r>
+        <w:rPr>
+          <w:sz w:val="32"/>
+          <w:szCs w:val="32"/>
+        </w:rPr>
+        <w:t>dio</w:t>
+      </w:r>
+      <w:proofErr w:type="spellEnd"/>
+      <w:r>
+        <w:rPr>
+          <w:sz w:val="32"/>
+          <w:szCs w:val="32"/>
+        </w:rPr>
+        <w:t>:</w:t>
+      </w:r>
+    </w:p>
+    <w:p>
+      <w:pPr>
+        <w:jc w:val="both"/>
+        <w:rPr>
+          <w:sz w:val="32"/>
+          <w:szCs w:val="32"/>
+        </w:rPr>
+      </w:pPr>
+      <w:r>
+        <w:rPr>
+          <w:sz w:val="32"/>
+          <w:szCs w:val="32"/>
+        </w:rPr>
+        <w:t xml:space="preserve"># </w:t>
+      </w:r>
     </w:p>
     <w:sectPr>
       <w:footerReference w:type="default" r:id="rId7"/>
@@ -316,8 +4408,124 @@
       </w:pPr>
     </w:lvl>
   </w:abstractNum>
+  <w:abstractNum w:abstractNumId="1" w15:restartNumberingAfterBreak="0">
+    <w:nsid w:val="64B77DCC"/>
+    <w:multiLevelType w:val="hybridMultilevel"/>
+    <w:tmpl w:val="ABFE99EA"/>
+    <w:lvl w:ilvl="0" w:tplc="04090001">
+      <w:start w:val="1"/>
+      <w:numFmt w:val="bullet"/>
+      <w:lvlText w:val=""/>
+      <w:lvlJc w:val="left"/>
+      <w:pPr>
+        <w:ind w:left="360" w:hanging="360"/>
+      </w:pPr>
+      <w:rPr>
+        <w:rFonts w:ascii="Symbol" w:hAnsi="Symbol" w:hint="default"/>
+      </w:rPr>
+    </w:lvl>
+    <w:lvl w:ilvl="1" w:tplc="04090003" w:tentative="1">
+      <w:start w:val="1"/>
+      <w:numFmt w:val="bullet"/>
+      <w:lvlText w:val="o"/>
+      <w:lvlJc w:val="left"/>
+      <w:pPr>
+        <w:ind w:left="1080" w:hanging="360"/>
+      </w:pPr>
+      <w:rPr>
+        <w:rFonts w:ascii="Courier New" w:hAnsi="Courier New" w:cs="Courier New" w:hint="default"/>
+      </w:rPr>
+    </w:lvl>
+    <w:lvl w:ilvl="2" w:tplc="04090005" w:tentative="1">
+      <w:start w:val="1"/>
+      <w:numFmt w:val="bullet"/>
+      <w:lvlText w:val=""/>
+      <w:lvlJc w:val="left"/>
+      <w:pPr>
+        <w:ind w:left="1800" w:hanging="360"/>
+      </w:pPr>
+      <w:rPr>
+        <w:rFonts w:ascii="Wingdings" w:hAnsi="Wingdings" w:hint="default"/>
+      </w:rPr>
+    </w:lvl>
+    <w:lvl w:ilvl="3" w:tplc="04090001" w:tentative="1">
+      <w:start w:val="1"/>
+      <w:numFmt w:val="bullet"/>
+      <w:lvlText w:val=""/>
+      <w:lvlJc w:val="left"/>
+      <w:pPr>
+        <w:ind w:left="2520" w:hanging="360"/>
+      </w:pPr>
+      <w:rPr>
+        <w:rFonts w:ascii="Symbol" w:hAnsi="Symbol" w:hint="default"/>
+      </w:rPr>
+    </w:lvl>
+    <w:lvl w:ilvl="4" w:tplc="04090003" w:tentative="1">
+      <w:start w:val="1"/>
+      <w:numFmt w:val="bullet"/>
+      <w:lvlText w:val="o"/>
+      <w:lvlJc w:val="left"/>
+      <w:pPr>
+        <w:ind w:left="3240" w:hanging="360"/>
+      </w:pPr>
+      <w:rPr>
+        <w:rFonts w:ascii="Courier New" w:hAnsi="Courier New" w:cs="Courier New" w:hint="default"/>
+      </w:rPr>
+    </w:lvl>
+    <w:lvl w:ilvl="5" w:tplc="04090005" w:tentative="1">
+      <w:start w:val="1"/>
+      <w:numFmt w:val="bullet"/>
+      <w:lvlText w:val=""/>
+      <w:lvlJc w:val="left"/>
+      <w:pPr>
+        <w:ind w:left="3960" w:hanging="360"/>
+      </w:pPr>
+      <w:rPr>
+        <w:rFonts w:ascii="Wingdings" w:hAnsi="Wingdings" w:hint="default"/>
+      </w:rPr>
+    </w:lvl>
+    <w:lvl w:ilvl="6" w:tplc="04090001" w:tentative="1">
+      <w:start w:val="1"/>
+      <w:numFmt w:val="bullet"/>
+      <w:lvlText w:val=""/>
+      <w:lvlJc w:val="left"/>
+      <w:pPr>
+        <w:ind w:left="4680" w:hanging="360"/>
+      </w:pPr>
+      <w:rPr>
+        <w:rFonts w:ascii="Symbol" w:hAnsi="Symbol" w:hint="default"/>
+      </w:rPr>
+    </w:lvl>
+    <w:lvl w:ilvl="7" w:tplc="04090003" w:tentative="1">
+      <w:start w:val="1"/>
+      <w:numFmt w:val="bullet"/>
+      <w:lvlText w:val="o"/>
+      <w:lvlJc w:val="left"/>
+      <w:pPr>
+        <w:ind w:left="5400" w:hanging="360"/>
+      </w:pPr>
+      <w:rPr>
+        <w:rFonts w:ascii="Courier New" w:hAnsi="Courier New" w:cs="Courier New" w:hint="default"/>
+      </w:rPr>
+    </w:lvl>
+    <w:lvl w:ilvl="8" w:tplc="04090005" w:tentative="1">
+      <w:start w:val="1"/>
+      <w:numFmt w:val="bullet"/>
+      <w:lvlText w:val=""/>
+      <w:lvlJc w:val="left"/>
+      <w:pPr>
+        <w:ind w:left="6120" w:hanging="360"/>
+      </w:pPr>
+      <w:rPr>
+        <w:rFonts w:ascii="Wingdings" w:hAnsi="Wingdings" w:hint="default"/>
+      </w:rPr>
+    </w:lvl>
+  </w:abstractNum>
   <w:num w:numId="1" w16cid:durableId="1989436403">
     <w:abstractNumId w:val="0"/>
+  </w:num>
+  <w:num w:numId="2" w16cid:durableId="547187257">
+    <w:abstractNumId w:val="1"/>
   </w:num>
 </w:numbering>
 </file>
@@ -925,7 +5133,6 @@
   <w:style w:type="character" w:default="1" w:styleId="DefaultParagraphFont">
     <w:name w:val="Default Paragraph Font"/>
     <w:uiPriority w:val="1"/>
-    <w:semiHidden/>
     <w:unhideWhenUsed/>
   </w:style>
   <w:style w:type="table" w:default="1" w:styleId="TableNormal">

</xml_diff>